<commit_message>
Complete school management system updates
</commit_message>
<xml_diff>
--- a/docs/DB-Design.docx
+++ b/docs/DB-Design.docx
@@ -764,16 +764,16 @@
         <w:tblLook w:val="04A0" w:firstRow="1" w:lastRow="0" w:firstColumn="1" w:lastColumn="0" w:noHBand="0" w:noVBand="1"/>
       </w:tblPr>
       <w:tblGrid>
-        <w:gridCol w:w="3103"/>
-        <w:gridCol w:w="5193"/>
+        <w:gridCol w:w="3078"/>
+        <w:gridCol w:w="5152"/>
       </w:tblGrid>
       <w:tr>
         <w:trPr>
-          <w:trHeight w:val="572"/>
+          <w:trHeight w:val="69"/>
         </w:trPr>
         <w:tc>
           <w:tcPr>
-            <w:tcW w:w="3103" w:type="dxa"/>
+            <w:tcW w:w="3078" w:type="dxa"/>
           </w:tcPr>
           <w:p>
             <w:pPr>
@@ -800,7 +800,7 @@
         </w:tc>
         <w:tc>
           <w:tcPr>
-            <w:tcW w:w="5193" w:type="dxa"/>
+            <w:tcW w:w="5152" w:type="dxa"/>
           </w:tcPr>
           <w:p>
             <w:pPr>
@@ -827,9 +827,12 @@
         </w:tc>
       </w:tr>
       <w:tr>
-        <w:tc>
-          <w:tcPr>
-            <w:tcW w:w="3103" w:type="dxa"/>
+        <w:trPr>
+          <w:trHeight w:val="36"/>
+        </w:trPr>
+        <w:tc>
+          <w:tcPr>
+            <w:tcW w:w="3078" w:type="dxa"/>
           </w:tcPr>
           <w:p>
             <w:pPr>
@@ -852,7 +855,7 @@
         </w:tc>
         <w:tc>
           <w:tcPr>
-            <w:tcW w:w="5193" w:type="dxa"/>
+            <w:tcW w:w="5152" w:type="dxa"/>
           </w:tcPr>
           <w:p>
             <w:pPr>
@@ -884,9 +887,13 @@
         </w:tc>
       </w:tr>
       <w:tr>
-        <w:tc>
-          <w:tcPr>
-            <w:tcW w:w="3103" w:type="dxa"/>
+        <w:trPr>
+          <w:trHeight w:val="107"/>
+        </w:trPr>
+        <w:tc>
+          <w:tcPr>
+            <w:tcW w:w="3078" w:type="dxa"/>
+            <w:vAlign w:val="center"/>
           </w:tcPr>
           <w:p>
             <w:pPr>
@@ -909,7 +916,7 @@
         </w:tc>
         <w:tc>
           <w:tcPr>
-            <w:tcW w:w="5193" w:type="dxa"/>
+            <w:tcW w:w="5152" w:type="dxa"/>
           </w:tcPr>
           <w:p>
             <w:pPr>
@@ -971,7 +978,23 @@
                 <w:sz w:val="26"/>
                 <w:szCs w:val="26"/>
               </w:rPr>
-              <w:t>, Age, Gender, Phone, Email, Address (</w:t>
+              <w:t>,</w:t>
+            </w:r>
+            <w:r>
+              <w:rPr>
+                <w:rFonts w:ascii="Times New Roman" w:hAnsi="Times New Roman" w:cs="Times New Roman"/>
+                <w:sz w:val="26"/>
+                <w:szCs w:val="26"/>
+              </w:rPr>
+              <w:t xml:space="preserve"> </w:t>
+            </w:r>
+            <w:r>
+              <w:rPr>
+                <w:rFonts w:ascii="Times New Roman" w:hAnsi="Times New Roman" w:cs="Times New Roman"/>
+                <w:sz w:val="26"/>
+                <w:szCs w:val="26"/>
+              </w:rPr>
+              <w:t xml:space="preserve">Gender, Phone, Email, </w:t>
             </w:r>
             <w:proofErr w:type="spellStart"/>
             <w:r>
@@ -989,7 +1012,7 @@
                 <w:sz w:val="26"/>
                 <w:szCs w:val="26"/>
               </w:rPr>
-              <w:t xml:space="preserve">, City, Pin), </w:t>
+              <w:t xml:space="preserve">, City, Pin, </w:t>
             </w:r>
             <w:proofErr w:type="spellStart"/>
             <w:r>
@@ -1005,9 +1028,13 @@
         </w:tc>
       </w:tr>
       <w:tr>
-        <w:tc>
-          <w:tcPr>
-            <w:tcW w:w="3103" w:type="dxa"/>
+        <w:trPr>
+          <w:trHeight w:val="107"/>
+        </w:trPr>
+        <w:tc>
+          <w:tcPr>
+            <w:tcW w:w="3078" w:type="dxa"/>
+            <w:vAlign w:val="center"/>
           </w:tcPr>
           <w:p>
             <w:pPr>
@@ -1030,7 +1057,7 @@
         </w:tc>
         <w:tc>
           <w:tcPr>
-            <w:tcW w:w="5193" w:type="dxa"/>
+            <w:tcW w:w="5152" w:type="dxa"/>
           </w:tcPr>
           <w:p>
             <w:pPr>
@@ -1134,9 +1161,12 @@
         </w:tc>
       </w:tr>
       <w:tr>
-        <w:tc>
-          <w:tcPr>
-            <w:tcW w:w="3103" w:type="dxa"/>
+        <w:trPr>
+          <w:trHeight w:val="34"/>
+        </w:trPr>
+        <w:tc>
+          <w:tcPr>
+            <w:tcW w:w="3078" w:type="dxa"/>
           </w:tcPr>
           <w:p>
             <w:pPr>
@@ -1159,7 +1189,7 @@
         </w:tc>
         <w:tc>
           <w:tcPr>
-            <w:tcW w:w="5193" w:type="dxa"/>
+            <w:tcW w:w="5152" w:type="dxa"/>
           </w:tcPr>
           <w:p>
             <w:pPr>
@@ -1209,9 +1239,13 @@
         </w:tc>
       </w:tr>
       <w:tr>
-        <w:tc>
-          <w:tcPr>
-            <w:tcW w:w="3103" w:type="dxa"/>
+        <w:trPr>
+          <w:trHeight w:val="34"/>
+        </w:trPr>
+        <w:tc>
+          <w:tcPr>
+            <w:tcW w:w="3078" w:type="dxa"/>
+            <w:vAlign w:val="center"/>
           </w:tcPr>
           <w:p>
             <w:pPr>
@@ -1228,14 +1262,13 @@
                 <w:sz w:val="26"/>
                 <w:szCs w:val="26"/>
               </w:rPr>
-              <w:lastRenderedPageBreak/>
               <w:t>Report</w:t>
             </w:r>
           </w:p>
         </w:tc>
         <w:tc>
           <w:tcPr>
-            <w:tcW w:w="5193" w:type="dxa"/>
+            <w:tcW w:w="5152" w:type="dxa"/>
           </w:tcPr>
           <w:p>
             <w:pPr>
@@ -1297,25 +1330,7 @@
                 <w:sz w:val="26"/>
                 <w:szCs w:val="26"/>
               </w:rPr>
-              <w:t xml:space="preserve">, </w:t>
-            </w:r>
-            <w:proofErr w:type="spellStart"/>
-            <w:r>
-              <w:rPr>
-                <w:rFonts w:ascii="Times New Roman" w:hAnsi="Times New Roman" w:cs="Times New Roman"/>
-                <w:sz w:val="26"/>
-                <w:szCs w:val="26"/>
-              </w:rPr>
-              <w:t>TotalMarks</w:t>
-            </w:r>
-            <w:proofErr w:type="spellEnd"/>
-            <w:r>
-              <w:rPr>
-                <w:rFonts w:ascii="Times New Roman" w:hAnsi="Times New Roman" w:cs="Times New Roman"/>
-                <w:sz w:val="26"/>
-                <w:szCs w:val="26"/>
-              </w:rPr>
-              <w:t>, Average, Grade</w:t>
+              <w:t xml:space="preserve"> </w:t>
             </w:r>
           </w:p>
         </w:tc>
@@ -1332,10 +1347,7 @@
           <w:szCs w:val="26"/>
         </w:rPr>
       </w:pPr>
-    </w:p>
-    <w:p>
-      <w:pPr>
-        <w:ind w:left="720"/>
+      <w:r>
         <w:rPr>
           <w:rFonts w:ascii="Times New Roman" w:hAnsi="Times New Roman" w:cs="Times New Roman"/>
           <w:b/>
@@ -1343,15 +1355,7 @@
           <w:sz w:val="26"/>
           <w:szCs w:val="26"/>
         </w:rPr>
-      </w:pPr>
-      <w:r>
-        <w:rPr>
-          <w:rFonts w:ascii="Times New Roman" w:hAnsi="Times New Roman" w:cs="Times New Roman"/>
-          <w:b/>
-          <w:bCs/>
-          <w:sz w:val="26"/>
-          <w:szCs w:val="26"/>
-        </w:rPr>
+        <w:lastRenderedPageBreak/>
         <w:t>Relationships</w:t>
       </w:r>
     </w:p>
@@ -1529,7 +1533,25 @@
           <w:sz w:val="26"/>
           <w:szCs w:val="26"/>
         </w:rPr>
-        <w:t>Each report belongs to one student and is generated using the corresponding marks record (</w:t>
+        <w:t xml:space="preserve">Each report references one </w:t>
+      </w:r>
+      <w:proofErr w:type="gramStart"/>
+      <w:r>
+        <w:rPr>
+          <w:rFonts w:ascii="Times New Roman" w:hAnsi="Times New Roman" w:cs="Times New Roman"/>
+          <w:sz w:val="26"/>
+          <w:szCs w:val="26"/>
+        </w:rPr>
+        <w:t>student</w:t>
+      </w:r>
+      <w:proofErr w:type="gramEnd"/>
+      <w:r>
+        <w:rPr>
+          <w:rFonts w:ascii="Times New Roman" w:hAnsi="Times New Roman" w:cs="Times New Roman"/>
+          <w:sz w:val="26"/>
+          <w:szCs w:val="26"/>
+        </w:rPr>
+        <w:t xml:space="preserve"> and one marks record through </w:t>
       </w:r>
       <w:proofErr w:type="spellStart"/>
       <w:r>
@@ -1538,6 +1560,24 @@
           <w:sz w:val="26"/>
           <w:szCs w:val="26"/>
         </w:rPr>
+        <w:t>RegNo</w:t>
+      </w:r>
+      <w:proofErr w:type="spellEnd"/>
+      <w:r>
+        <w:rPr>
+          <w:rFonts w:ascii="Times New Roman" w:hAnsi="Times New Roman" w:cs="Times New Roman"/>
+          <w:sz w:val="26"/>
+          <w:szCs w:val="26"/>
+        </w:rPr>
+        <w:t xml:space="preserve"> and </w:t>
+      </w:r>
+      <w:proofErr w:type="spellStart"/>
+      <w:r>
+        <w:rPr>
+          <w:rFonts w:ascii="Times New Roman" w:hAnsi="Times New Roman" w:cs="Times New Roman"/>
+          <w:sz w:val="26"/>
+          <w:szCs w:val="26"/>
+        </w:rPr>
         <w:t>MarkID</w:t>
       </w:r>
       <w:proofErr w:type="spellEnd"/>
@@ -1547,16 +1587,18 @@
           <w:sz w:val="26"/>
           <w:szCs w:val="26"/>
         </w:rPr>
-        <w:t>)</w:t>
-      </w:r>
-      <w:r>
-        <w:rPr>
-          <w:rFonts w:ascii="Times New Roman" w:hAnsi="Times New Roman" w:cs="Times New Roman"/>
-          <w:sz w:val="26"/>
-          <w:szCs w:val="26"/>
-        </w:rPr>
         <w:t>.</w:t>
       </w:r>
+    </w:p>
+    <w:p>
+      <w:pPr>
+        <w:ind w:left="720"/>
+        <w:rPr>
+          <w:rFonts w:ascii="Times New Roman" w:hAnsi="Times New Roman" w:cs="Times New Roman"/>
+          <w:sz w:val="26"/>
+          <w:szCs w:val="26"/>
+        </w:rPr>
+      </w:pPr>
     </w:p>
     <w:p>
       <w:pPr>
@@ -1757,7 +1799,7 @@
           <w:sz w:val="26"/>
           <w:szCs w:val="26"/>
         </w:rPr>
-        <w:t xml:space="preserve">Reports are generated for each student using the corresponding marks record. </w:t>
+        <w:t xml:space="preserve">Reports reference the corresponding student and marks record. </w:t>
       </w:r>
       <w:proofErr w:type="spellStart"/>
       <w:r>
@@ -1775,15 +1817,7 @@
           <w:sz w:val="26"/>
           <w:szCs w:val="26"/>
         </w:rPr>
-        <w:t>, Average, and Grade are derived attributes</w:t>
-      </w:r>
-      <w:r>
-        <w:rPr>
-          <w:rFonts w:ascii="Times New Roman" w:hAnsi="Times New Roman" w:cs="Times New Roman"/>
-          <w:sz w:val="26"/>
-          <w:szCs w:val="26"/>
-        </w:rPr>
-        <w:t>.</w:t>
+        <w:t>, Average, and Grade are derived values calculated in the STUDENT_REPORTS view.</w:t>
       </w:r>
     </w:p>
     <w:p>
@@ -1964,17 +1998,15 @@
       <w:r>
         <w:rPr>
           <w:rFonts w:ascii="Times New Roman" w:hAnsi="Times New Roman" w:cs="Times New Roman"/>
-          <w:i/>
-          <w:iCs/>
           <w:noProof/>
           <w:sz w:val="26"/>
           <w:szCs w:val="26"/>
         </w:rPr>
         <w:drawing>
-          <wp:inline distT="0" distB="0" distL="0" distR="0" wp14:anchorId="2E52EBA4" wp14:editId="40AE775F">
-            <wp:extent cx="5731510" cy="3878580"/>
-            <wp:effectExtent l="0" t="0" r="2540" b="7620"/>
-            <wp:docPr id="1185017044" name="Picture 1"/>
+          <wp:inline distT="0" distB="0" distL="0" distR="0" wp14:anchorId="269D716B" wp14:editId="03AD4A07">
+            <wp:extent cx="5731510" cy="4123690"/>
+            <wp:effectExtent l="0" t="0" r="2540" b="0"/>
+            <wp:docPr id="57278920" name="Picture 1"/>
             <wp:cNvGraphicFramePr>
               <a:graphicFrameLocks xmlns:a="http://schemas.openxmlformats.org/drawingml/2006/main" noChangeAspect="1"/>
             </wp:cNvGraphicFramePr>
@@ -1982,11 +2014,17 @@
               <a:graphicData uri="http://schemas.openxmlformats.org/drawingml/2006/picture">
                 <pic:pic xmlns:pic="http://schemas.openxmlformats.org/drawingml/2006/picture">
                   <pic:nvPicPr>
-                    <pic:cNvPr id="1185017044" name=""/>
+                    <pic:cNvPr id="57278920" name="Picture 57278920"/>
                     <pic:cNvPicPr/>
                   </pic:nvPicPr>
                   <pic:blipFill>
-                    <a:blip r:embed="rId7"/>
+                    <a:blip r:embed="rId7">
+                      <a:extLst>
+                        <a:ext uri="{28A0092B-C50C-407E-A947-70E740481C1C}">
+                          <a14:useLocalDpi xmlns:a14="http://schemas.microsoft.com/office/drawing/2010/main" val="0"/>
+                        </a:ext>
+                      </a:extLst>
+                    </a:blip>
                     <a:stretch>
                       <a:fillRect/>
                     </a:stretch>
@@ -1994,7 +2032,7 @@
                   <pic:spPr>
                     <a:xfrm>
                       <a:off x="0" y="0"/>
-                      <a:ext cx="5731510" cy="3878580"/>
+                      <a:ext cx="5731510" cy="4123690"/>
                     </a:xfrm>
                     <a:prstGeom prst="rect">
                       <a:avLst/>
@@ -2028,10 +2066,6 @@
       <w:tblPr>
         <w:tblStyle w:val="TableGrid"/>
         <w:tblW w:w="0" w:type="auto"/>
-        <w:tblBorders>
-          <w:insideH w:val="none" w:sz="0" w:space="0" w:color="auto"/>
-          <w:insideV w:val="none" w:sz="0" w:space="0" w:color="auto"/>
-        </w:tblBorders>
         <w:tblLook w:val="04A0" w:firstRow="1" w:lastRow="0" w:firstColumn="1" w:lastColumn="0" w:noHBand="0" w:noVBand="1"/>
       </w:tblPr>
       <w:tblGrid>
@@ -2047,10 +2081,7 @@
           <w:tcPr>
             <w:tcW w:w="7780" w:type="dxa"/>
             <w:gridSpan w:val="3"/>
-            <w:tcBorders>
-              <w:top w:val="single" w:sz="4" w:space="0" w:color="auto"/>
-              <w:bottom w:val="single" w:sz="4" w:space="0" w:color="4472C4" w:themeColor="accent1"/>
-            </w:tcBorders>
+            <w:vAlign w:val="center"/>
           </w:tcPr>
           <w:p>
             <w:pPr>
@@ -2069,9 +2100,7 @@
         <w:tc>
           <w:tcPr>
             <w:tcW w:w="2593" w:type="dxa"/>
-            <w:tcBorders>
-              <w:top w:val="single" w:sz="4" w:space="0" w:color="4472C4" w:themeColor="accent1"/>
-            </w:tcBorders>
+            <w:vAlign w:val="center"/>
           </w:tcPr>
           <w:p>
             <w:pPr>
@@ -2087,9 +2116,7 @@
         <w:tc>
           <w:tcPr>
             <w:tcW w:w="2593" w:type="dxa"/>
-            <w:tcBorders>
-              <w:top w:val="single" w:sz="4" w:space="0" w:color="4472C4" w:themeColor="accent1"/>
-            </w:tcBorders>
+            <w:vAlign w:val="center"/>
           </w:tcPr>
           <w:p>
             <w:pPr>
@@ -2108,16 +2135,14 @@
         <w:tc>
           <w:tcPr>
             <w:tcW w:w="2594" w:type="dxa"/>
-            <w:tcBorders>
-              <w:top w:val="single" w:sz="4" w:space="0" w:color="4472C4" w:themeColor="accent1"/>
-            </w:tcBorders>
-          </w:tcPr>
-          <w:p>
-            <w:pPr>
-              <w:jc w:val="center"/>
-            </w:pPr>
-            <w:r>
-              <w:t>PK, NOT NULL</w:t>
+            <w:vAlign w:val="center"/>
+          </w:tcPr>
+          <w:p>
+            <w:pPr>
+              <w:jc w:val="center"/>
+            </w:pPr>
+            <w:r>
+              <w:t>PK</w:t>
             </w:r>
           </w:p>
         </w:tc>
@@ -2129,6 +2154,7 @@
         <w:tc>
           <w:tcPr>
             <w:tcW w:w="2593" w:type="dxa"/>
+            <w:vAlign w:val="center"/>
           </w:tcPr>
           <w:p>
             <w:pPr>
@@ -2142,6 +2168,7 @@
         <w:tc>
           <w:tcPr>
             <w:tcW w:w="2593" w:type="dxa"/>
+            <w:vAlign w:val="center"/>
           </w:tcPr>
           <w:p>
             <w:pPr>
@@ -2160,6 +2187,7 @@
         <w:tc>
           <w:tcPr>
             <w:tcW w:w="2594" w:type="dxa"/>
+            <w:vAlign w:val="center"/>
           </w:tcPr>
           <w:p>
             <w:pPr>
@@ -2178,6 +2206,7 @@
         <w:tc>
           <w:tcPr>
             <w:tcW w:w="2593" w:type="dxa"/>
+            <w:vAlign w:val="center"/>
           </w:tcPr>
           <w:p>
             <w:pPr>
@@ -2191,6 +2220,7 @@
         <w:tc>
           <w:tcPr>
             <w:tcW w:w="2593" w:type="dxa"/>
+            <w:vAlign w:val="center"/>
           </w:tcPr>
           <w:p>
             <w:pPr>
@@ -2209,6 +2239,7 @@
         <w:tc>
           <w:tcPr>
             <w:tcW w:w="2594" w:type="dxa"/>
+            <w:vAlign w:val="center"/>
           </w:tcPr>
           <w:p>
             <w:pPr>
@@ -2226,10 +2257,6 @@
       <w:tblPr>
         <w:tblStyle w:val="TableGrid"/>
         <w:tblW w:w="0" w:type="auto"/>
-        <w:tblBorders>
-          <w:insideH w:val="none" w:sz="0" w:space="0" w:color="auto"/>
-          <w:insideV w:val="none" w:sz="0" w:space="0" w:color="auto"/>
-        </w:tblBorders>
         <w:tblLook w:val="04A0" w:firstRow="1" w:lastRow="0" w:firstColumn="1" w:lastColumn="0" w:noHBand="0" w:noVBand="1"/>
       </w:tblPr>
       <w:tblGrid>
@@ -2245,10 +2272,7 @@
           <w:tcPr>
             <w:tcW w:w="8151" w:type="dxa"/>
             <w:gridSpan w:val="3"/>
-            <w:tcBorders>
-              <w:top w:val="single" w:sz="4" w:space="0" w:color="auto"/>
-              <w:bottom w:val="single" w:sz="4" w:space="0" w:color="4472C4" w:themeColor="accent1"/>
-            </w:tcBorders>
+            <w:vAlign w:val="center"/>
           </w:tcPr>
           <w:p>
             <w:pPr>
@@ -2267,9 +2291,7 @@
         <w:tc>
           <w:tcPr>
             <w:tcW w:w="2597" w:type="dxa"/>
-            <w:tcBorders>
-              <w:top w:val="single" w:sz="4" w:space="0" w:color="4472C4" w:themeColor="accent1"/>
-            </w:tcBorders>
+            <w:vAlign w:val="center"/>
           </w:tcPr>
           <w:p>
             <w:pPr>
@@ -2285,9 +2307,7 @@
         <w:tc>
           <w:tcPr>
             <w:tcW w:w="2955" w:type="dxa"/>
-            <w:tcBorders>
-              <w:top w:val="single" w:sz="4" w:space="0" w:color="4472C4" w:themeColor="accent1"/>
-            </w:tcBorders>
+            <w:vAlign w:val="center"/>
           </w:tcPr>
           <w:p>
             <w:pPr>
@@ -2306,16 +2326,14 @@
         <w:tc>
           <w:tcPr>
             <w:tcW w:w="2599" w:type="dxa"/>
-            <w:tcBorders>
-              <w:top w:val="single" w:sz="4" w:space="0" w:color="4472C4" w:themeColor="accent1"/>
-            </w:tcBorders>
-          </w:tcPr>
-          <w:p>
-            <w:pPr>
-              <w:jc w:val="center"/>
-            </w:pPr>
-            <w:r>
-              <w:t>PK, NOT NULL</w:t>
+            <w:vAlign w:val="center"/>
+          </w:tcPr>
+          <w:p>
+            <w:pPr>
+              <w:jc w:val="center"/>
+            </w:pPr>
+            <w:r>
+              <w:t>PK</w:t>
             </w:r>
           </w:p>
         </w:tc>
@@ -2327,6 +2345,7 @@
         <w:tc>
           <w:tcPr>
             <w:tcW w:w="2597" w:type="dxa"/>
+            <w:vAlign w:val="center"/>
           </w:tcPr>
           <w:p>
             <w:pPr>
@@ -2342,6 +2361,7 @@
         <w:tc>
           <w:tcPr>
             <w:tcW w:w="2955" w:type="dxa"/>
+            <w:vAlign w:val="center"/>
           </w:tcPr>
           <w:p>
             <w:pPr>
@@ -2360,6 +2380,7 @@
         <w:tc>
           <w:tcPr>
             <w:tcW w:w="2599" w:type="dxa"/>
+            <w:vAlign w:val="center"/>
           </w:tcPr>
           <w:p>
             <w:pPr>
@@ -2378,6 +2399,7 @@
         <w:tc>
           <w:tcPr>
             <w:tcW w:w="2597" w:type="dxa"/>
+            <w:vAlign w:val="center"/>
           </w:tcPr>
           <w:p>
             <w:pPr>
@@ -2391,6 +2413,7 @@
         <w:tc>
           <w:tcPr>
             <w:tcW w:w="2955" w:type="dxa"/>
+            <w:vAlign w:val="center"/>
           </w:tcPr>
           <w:p>
             <w:pPr>
@@ -2409,6 +2432,7 @@
         <w:tc>
           <w:tcPr>
             <w:tcW w:w="2599" w:type="dxa"/>
+            <w:vAlign w:val="center"/>
           </w:tcPr>
           <w:p>
             <w:pPr>
@@ -2427,6 +2451,7 @@
         <w:tc>
           <w:tcPr>
             <w:tcW w:w="2597" w:type="dxa"/>
+            <w:vAlign w:val="center"/>
           </w:tcPr>
           <w:p>
             <w:pPr>
@@ -2442,6 +2467,7 @@
         <w:tc>
           <w:tcPr>
             <w:tcW w:w="2955" w:type="dxa"/>
+            <w:vAlign w:val="center"/>
           </w:tcPr>
           <w:p>
             <w:pPr>
@@ -2455,6 +2481,7 @@
         <w:tc>
           <w:tcPr>
             <w:tcW w:w="2599" w:type="dxa"/>
+            <w:vAlign w:val="center"/>
           </w:tcPr>
           <w:p>
             <w:pPr>
@@ -2473,39 +2500,108 @@
         <w:tc>
           <w:tcPr>
             <w:tcW w:w="2597" w:type="dxa"/>
-          </w:tcPr>
-          <w:p>
-            <w:pPr>
-              <w:jc w:val="center"/>
-            </w:pPr>
-            <w:r>
-              <w:t>Age</w:t>
+            <w:vAlign w:val="center"/>
+          </w:tcPr>
+          <w:p>
+            <w:pPr>
+              <w:jc w:val="center"/>
+            </w:pPr>
+            <w:r>
+              <w:t>Gender</w:t>
             </w:r>
           </w:p>
         </w:tc>
         <w:tc>
           <w:tcPr>
             <w:tcW w:w="2955" w:type="dxa"/>
-          </w:tcPr>
-          <w:p>
-            <w:pPr>
-              <w:jc w:val="center"/>
-            </w:pPr>
-            <w:r>
-              <w:t>INT</w:t>
+            <w:vAlign w:val="center"/>
+          </w:tcPr>
+          <w:p>
+            <w:pPr>
+              <w:jc w:val="center"/>
+            </w:pPr>
+            <w:proofErr w:type="gramStart"/>
+            <w:r>
+              <w:t>VARCHAR(</w:t>
+            </w:r>
+            <w:proofErr w:type="gramEnd"/>
+            <w:r>
+              <w:t>10)</w:t>
             </w:r>
           </w:p>
         </w:tc>
         <w:tc>
           <w:tcPr>
             <w:tcW w:w="2599" w:type="dxa"/>
-          </w:tcPr>
-          <w:p>
-            <w:pPr>
-              <w:jc w:val="center"/>
-            </w:pPr>
-            <w:r>
-              <w:t>Derived</w:t>
+            <w:vAlign w:val="center"/>
+          </w:tcPr>
+          <w:p>
+            <w:pPr>
+              <w:jc w:val="center"/>
+            </w:pPr>
+            <w:r>
+              <w:t>NOT NULL</w:t>
+            </w:r>
+            <w:r>
+              <w:t xml:space="preserve">, </w:t>
+            </w:r>
+            <w:r>
+              <w:t>C</w:t>
+            </w:r>
+            <w:r>
+              <w:t>HECK: Male / Female / Other</w:t>
+            </w:r>
+          </w:p>
+        </w:tc>
+      </w:tr>
+      <w:tr>
+        <w:trPr>
+          <w:trHeight w:val="283"/>
+        </w:trPr>
+        <w:tc>
+          <w:tcPr>
+            <w:tcW w:w="2597" w:type="dxa"/>
+            <w:vAlign w:val="center"/>
+          </w:tcPr>
+          <w:p>
+            <w:pPr>
+              <w:jc w:val="center"/>
+            </w:pPr>
+            <w:r>
+              <w:t>Phone</w:t>
+            </w:r>
+          </w:p>
+        </w:tc>
+        <w:tc>
+          <w:tcPr>
+            <w:tcW w:w="2955" w:type="dxa"/>
+            <w:vAlign w:val="center"/>
+          </w:tcPr>
+          <w:p>
+            <w:pPr>
+              <w:jc w:val="center"/>
+            </w:pPr>
+            <w:proofErr w:type="gramStart"/>
+            <w:r>
+              <w:t>VARCHAR(</w:t>
+            </w:r>
+            <w:proofErr w:type="gramEnd"/>
+            <w:r>
+              <w:t>15)</w:t>
+            </w:r>
+          </w:p>
+        </w:tc>
+        <w:tc>
+          <w:tcPr>
+            <w:tcW w:w="2599" w:type="dxa"/>
+            <w:vAlign w:val="center"/>
+          </w:tcPr>
+          <w:p>
+            <w:pPr>
+              <w:jc w:val="center"/>
+            </w:pPr>
+            <w:r>
+              <w:t>NOT NULL</w:t>
             </w:r>
           </w:p>
         </w:tc>
@@ -2517,47 +2613,107 @@
         <w:tc>
           <w:tcPr>
             <w:tcW w:w="2597" w:type="dxa"/>
-          </w:tcPr>
-          <w:p>
-            <w:pPr>
-              <w:jc w:val="center"/>
-            </w:pPr>
-            <w:r>
-              <w:t>Gender</w:t>
-            </w:r>
+            <w:vAlign w:val="center"/>
+          </w:tcPr>
+          <w:p>
+            <w:pPr>
+              <w:jc w:val="center"/>
+            </w:pPr>
+            <w:proofErr w:type="spellStart"/>
+            <w:r>
+              <w:t>AdminID</w:t>
+            </w:r>
+            <w:proofErr w:type="spellEnd"/>
           </w:p>
         </w:tc>
         <w:tc>
           <w:tcPr>
             <w:tcW w:w="2955" w:type="dxa"/>
-          </w:tcPr>
-          <w:p>
-            <w:pPr>
-              <w:jc w:val="center"/>
-            </w:pPr>
-            <w:r>
-              <w:t>ENUM('</w:t>
-            </w:r>
-            <w:proofErr w:type="spellStart"/>
-            <w:r>
-              <w:t>Male','Female','Other</w:t>
-            </w:r>
-            <w:proofErr w:type="spellEnd"/>
-            <w:r>
-              <w:t>')</w:t>
+            <w:vAlign w:val="center"/>
+          </w:tcPr>
+          <w:p>
+            <w:pPr>
+              <w:jc w:val="center"/>
+            </w:pPr>
+            <w:proofErr w:type="gramStart"/>
+            <w:r>
+              <w:t>VARCHAR(</w:t>
+            </w:r>
+            <w:proofErr w:type="gramEnd"/>
+            <w:r>
+              <w:t>1</w:t>
+            </w:r>
+            <w:r>
+              <w:t>0)</w:t>
             </w:r>
           </w:p>
         </w:tc>
         <w:tc>
           <w:tcPr>
             <w:tcW w:w="2599" w:type="dxa"/>
-          </w:tcPr>
-          <w:p>
-            <w:pPr>
-              <w:jc w:val="center"/>
-            </w:pPr>
-            <w:r>
-              <w:t>NOT NULL</w:t>
+            <w:vAlign w:val="center"/>
+          </w:tcPr>
+          <w:p>
+            <w:pPr>
+              <w:jc w:val="center"/>
+            </w:pPr>
+            <w:r>
+              <w:t>F</w:t>
+            </w:r>
+            <w:r>
+              <w:t>K, NOT NULL</w:t>
+            </w:r>
+          </w:p>
+        </w:tc>
+      </w:tr>
+      <w:tr>
+        <w:trPr>
+          <w:trHeight w:val="271"/>
+        </w:trPr>
+        <w:tc>
+          <w:tcPr>
+            <w:tcW w:w="2597" w:type="dxa"/>
+            <w:vAlign w:val="center"/>
+          </w:tcPr>
+          <w:p>
+            <w:pPr>
+              <w:jc w:val="center"/>
+            </w:pPr>
+            <w:r>
+              <w:t>Email</w:t>
+            </w:r>
+          </w:p>
+        </w:tc>
+        <w:tc>
+          <w:tcPr>
+            <w:tcW w:w="2955" w:type="dxa"/>
+            <w:vAlign w:val="center"/>
+          </w:tcPr>
+          <w:p>
+            <w:pPr>
+              <w:jc w:val="center"/>
+            </w:pPr>
+            <w:proofErr w:type="gramStart"/>
+            <w:r>
+              <w:t>VARCHAR(</w:t>
+            </w:r>
+            <w:proofErr w:type="gramEnd"/>
+            <w:r>
+              <w:t>100)</w:t>
+            </w:r>
+          </w:p>
+        </w:tc>
+        <w:tc>
+          <w:tcPr>
+            <w:tcW w:w="2599" w:type="dxa"/>
+            <w:vAlign w:val="center"/>
+          </w:tcPr>
+          <w:p>
+            <w:pPr>
+              <w:jc w:val="center"/>
+            </w:pPr>
+            <w:r>
+              <w:t>UNIQUE, NOT NULL</w:t>
             </w:r>
           </w:p>
         </w:tc>
@@ -2569,19 +2725,23 @@
         <w:tc>
           <w:tcPr>
             <w:tcW w:w="2597" w:type="dxa"/>
-          </w:tcPr>
-          <w:p>
-            <w:pPr>
-              <w:jc w:val="center"/>
-            </w:pPr>
-            <w:r>
-              <w:t>Phone</w:t>
-            </w:r>
+            <w:vAlign w:val="center"/>
+          </w:tcPr>
+          <w:p>
+            <w:pPr>
+              <w:jc w:val="center"/>
+            </w:pPr>
+            <w:proofErr w:type="spellStart"/>
+            <w:r>
+              <w:t>HouseNo</w:t>
+            </w:r>
+            <w:proofErr w:type="spellEnd"/>
           </w:p>
         </w:tc>
         <w:tc>
           <w:tcPr>
             <w:tcW w:w="2955" w:type="dxa"/>
+            <w:vAlign w:val="center"/>
           </w:tcPr>
           <w:p>
             <w:pPr>
@@ -2593,13 +2753,14 @@
             </w:r>
             <w:proofErr w:type="gramEnd"/>
             <w:r>
-              <w:t>15)</w:t>
+              <w:t>20)</w:t>
             </w:r>
           </w:p>
         </w:tc>
         <w:tc>
           <w:tcPr>
             <w:tcW w:w="2599" w:type="dxa"/>
+            <w:vAlign w:val="center"/>
           </w:tcPr>
           <w:p>
             <w:pPr>
@@ -2618,21 +2779,21 @@
         <w:tc>
           <w:tcPr>
             <w:tcW w:w="2597" w:type="dxa"/>
-          </w:tcPr>
-          <w:p>
-            <w:pPr>
-              <w:jc w:val="center"/>
-            </w:pPr>
-            <w:proofErr w:type="spellStart"/>
-            <w:r>
-              <w:t>AdminID</w:t>
-            </w:r>
-            <w:proofErr w:type="spellEnd"/>
+            <w:vAlign w:val="center"/>
+          </w:tcPr>
+          <w:p>
+            <w:pPr>
+              <w:jc w:val="center"/>
+            </w:pPr>
+            <w:r>
+              <w:t>City</w:t>
+            </w:r>
           </w:p>
         </w:tc>
         <w:tc>
           <w:tcPr>
             <w:tcW w:w="2955" w:type="dxa"/>
+            <w:vAlign w:val="center"/>
           </w:tcPr>
           <w:p>
             <w:pPr>
@@ -2644,7 +2805,7 @@
             </w:r>
             <w:proofErr w:type="gramEnd"/>
             <w:r>
-              <w:t>1</w:t>
+              <w:t>5</w:t>
             </w:r>
             <w:r>
               <w:t>0)</w:t>
@@ -2654,16 +2815,14 @@
         <w:tc>
           <w:tcPr>
             <w:tcW w:w="2599" w:type="dxa"/>
-          </w:tcPr>
-          <w:p>
-            <w:pPr>
-              <w:jc w:val="center"/>
-            </w:pPr>
-            <w:r>
-              <w:t>F</w:t>
-            </w:r>
-            <w:r>
-              <w:t>K, NOT NULL</w:t>
+            <w:vAlign w:val="center"/>
+          </w:tcPr>
+          <w:p>
+            <w:pPr>
+              <w:jc w:val="center"/>
+            </w:pPr>
+            <w:r>
+              <w:t>NOT NULL</w:t>
             </w:r>
           </w:p>
         </w:tc>
@@ -2681,7 +2840,7 @@
               <w:jc w:val="center"/>
             </w:pPr>
             <w:r>
-              <w:t>Email</w:t>
+              <w:t>Pin</w:t>
             </w:r>
           </w:p>
         </w:tc>
@@ -2699,7 +2858,10 @@
             </w:r>
             <w:proofErr w:type="gramEnd"/>
             <w:r>
-              <w:t>100)</w:t>
+              <w:t>1</w:t>
+            </w:r>
+            <w:r>
+              <w:t>0)</w:t>
             </w:r>
           </w:p>
         </w:tc>
@@ -2712,177 +2874,17 @@
               <w:jc w:val="center"/>
             </w:pPr>
             <w:r>
-              <w:t>UNIQUE, NOT NULL</w:t>
-            </w:r>
-          </w:p>
-        </w:tc>
-      </w:tr>
-      <w:tr>
-        <w:trPr>
-          <w:trHeight w:val="283"/>
-        </w:trPr>
-        <w:tc>
-          <w:tcPr>
-            <w:tcW w:w="2597" w:type="dxa"/>
-          </w:tcPr>
-          <w:p>
-            <w:pPr>
-              <w:jc w:val="center"/>
-            </w:pPr>
-            <w:proofErr w:type="spellStart"/>
-            <w:r>
-              <w:t>HouseNo</w:t>
-            </w:r>
-            <w:proofErr w:type="spellEnd"/>
-          </w:p>
-        </w:tc>
-        <w:tc>
-          <w:tcPr>
-            <w:tcW w:w="2955" w:type="dxa"/>
-          </w:tcPr>
-          <w:p>
-            <w:pPr>
-              <w:jc w:val="center"/>
-            </w:pPr>
-            <w:proofErr w:type="gramStart"/>
-            <w:r>
-              <w:t>VARCHAR(</w:t>
-            </w:r>
-            <w:proofErr w:type="gramEnd"/>
-            <w:r>
-              <w:t>20)</w:t>
-            </w:r>
-          </w:p>
-        </w:tc>
-        <w:tc>
-          <w:tcPr>
-            <w:tcW w:w="2599" w:type="dxa"/>
-          </w:tcPr>
-          <w:p>
-            <w:pPr>
-              <w:jc w:val="center"/>
-            </w:pPr>
-            <w:r>
-              <w:t>Address (Composite)</w:t>
-            </w:r>
-          </w:p>
-        </w:tc>
-      </w:tr>
-      <w:tr>
-        <w:trPr>
-          <w:trHeight w:val="271"/>
-        </w:trPr>
-        <w:tc>
-          <w:tcPr>
-            <w:tcW w:w="2597" w:type="dxa"/>
-          </w:tcPr>
-          <w:p>
-            <w:pPr>
-              <w:jc w:val="center"/>
-            </w:pPr>
-            <w:r>
-              <w:t>City</w:t>
-            </w:r>
-          </w:p>
-        </w:tc>
-        <w:tc>
-          <w:tcPr>
-            <w:tcW w:w="2955" w:type="dxa"/>
-          </w:tcPr>
-          <w:p>
-            <w:pPr>
-              <w:jc w:val="center"/>
-            </w:pPr>
-            <w:proofErr w:type="gramStart"/>
-            <w:r>
-              <w:t>VARCHAR(</w:t>
-            </w:r>
-            <w:proofErr w:type="gramEnd"/>
-            <w:r>
-              <w:t>5</w:t>
-            </w:r>
-            <w:r>
-              <w:t>0)</w:t>
-            </w:r>
-          </w:p>
-        </w:tc>
-        <w:tc>
-          <w:tcPr>
-            <w:tcW w:w="2599" w:type="dxa"/>
-          </w:tcPr>
-          <w:p>
-            <w:pPr>
-              <w:jc w:val="center"/>
-            </w:pPr>
-            <w:r>
-              <w:t>Address (Composite)</w:t>
-            </w:r>
-          </w:p>
-        </w:tc>
-      </w:tr>
-      <w:tr>
-        <w:trPr>
-          <w:trHeight w:val="271"/>
-        </w:trPr>
-        <w:tc>
-          <w:tcPr>
-            <w:tcW w:w="2597" w:type="dxa"/>
-          </w:tcPr>
-          <w:p>
-            <w:pPr>
-              <w:jc w:val="center"/>
-            </w:pPr>
-            <w:r>
-              <w:t>Pin</w:t>
-            </w:r>
-          </w:p>
-        </w:tc>
-        <w:tc>
-          <w:tcPr>
-            <w:tcW w:w="2955" w:type="dxa"/>
-          </w:tcPr>
-          <w:p>
-            <w:pPr>
-              <w:jc w:val="center"/>
-            </w:pPr>
-            <w:proofErr w:type="gramStart"/>
-            <w:r>
-              <w:t>VARCHAR(</w:t>
-            </w:r>
-            <w:proofErr w:type="gramEnd"/>
-            <w:r>
-              <w:t>1</w:t>
-            </w:r>
-            <w:r>
-              <w:t>0)</w:t>
-            </w:r>
-          </w:p>
-        </w:tc>
-        <w:tc>
-          <w:tcPr>
-            <w:tcW w:w="2599" w:type="dxa"/>
-          </w:tcPr>
-          <w:p>
-            <w:pPr>
-              <w:jc w:val="center"/>
-            </w:pPr>
-            <w:r>
-              <w:t>Address (Composite)</w:t>
+              <w:t>NOT NULL</w:t>
             </w:r>
           </w:p>
         </w:tc>
       </w:tr>
     </w:tbl>
-    <w:p/>
     <w:p/>
     <w:tbl>
       <w:tblPr>
         <w:tblStyle w:val="TableGrid"/>
         <w:tblW w:w="0" w:type="auto"/>
-        <w:tblBorders>
-          <w:insideH w:val="none" w:sz="0" w:space="0" w:color="auto"/>
-          <w:insideV w:val="none" w:sz="0" w:space="0" w:color="auto"/>
-        </w:tblBorders>
         <w:tblLook w:val="04A0" w:firstRow="1" w:lastRow="0" w:firstColumn="1" w:lastColumn="0" w:noHBand="0" w:noVBand="1"/>
       </w:tblPr>
       <w:tblGrid>
@@ -2898,10 +2900,7 @@
           <w:tcPr>
             <w:tcW w:w="8151" w:type="dxa"/>
             <w:gridSpan w:val="3"/>
-            <w:tcBorders>
-              <w:top w:val="single" w:sz="4" w:space="0" w:color="auto"/>
-              <w:bottom w:val="single" w:sz="4" w:space="0" w:color="4472C4" w:themeColor="accent1"/>
-            </w:tcBorders>
+            <w:vAlign w:val="center"/>
           </w:tcPr>
           <w:p>
             <w:pPr>
@@ -2921,9 +2920,7 @@
         <w:tc>
           <w:tcPr>
             <w:tcW w:w="2597" w:type="dxa"/>
-            <w:tcBorders>
-              <w:top w:val="single" w:sz="4" w:space="0" w:color="4472C4" w:themeColor="accent1"/>
-            </w:tcBorders>
+            <w:vAlign w:val="center"/>
           </w:tcPr>
           <w:p>
             <w:pPr>
@@ -2939,32 +2936,28 @@
         <w:tc>
           <w:tcPr>
             <w:tcW w:w="2955" w:type="dxa"/>
-            <w:tcBorders>
-              <w:top w:val="single" w:sz="4" w:space="0" w:color="4472C4" w:themeColor="accent1"/>
-            </w:tcBorders>
-          </w:tcPr>
-          <w:p>
-            <w:pPr>
-              <w:jc w:val="center"/>
-            </w:pPr>
-            <w:r>
-              <w:t>INT AUTO_INCREMENT</w:t>
+            <w:vAlign w:val="center"/>
+          </w:tcPr>
+          <w:p>
+            <w:pPr>
+              <w:jc w:val="center"/>
+            </w:pPr>
+            <w:r>
+              <w:t>INTEGER GENERATED ALWAYS AS IDENTITY</w:t>
             </w:r>
           </w:p>
         </w:tc>
         <w:tc>
           <w:tcPr>
             <w:tcW w:w="2599" w:type="dxa"/>
-            <w:tcBorders>
-              <w:top w:val="single" w:sz="4" w:space="0" w:color="4472C4" w:themeColor="accent1"/>
-            </w:tcBorders>
-          </w:tcPr>
-          <w:p>
-            <w:pPr>
-              <w:jc w:val="center"/>
-            </w:pPr>
-            <w:r>
-              <w:t>PK, NOT NULL</w:t>
+            <w:vAlign w:val="center"/>
+          </w:tcPr>
+          <w:p>
+            <w:pPr>
+              <w:jc w:val="center"/>
+            </w:pPr>
+            <w:r>
+              <w:t>PK</w:t>
             </w:r>
           </w:p>
         </w:tc>
@@ -2976,6 +2969,7 @@
         <w:tc>
           <w:tcPr>
             <w:tcW w:w="2597" w:type="dxa"/>
+            <w:vAlign w:val="center"/>
           </w:tcPr>
           <w:p>
             <w:pPr>
@@ -2991,6 +2985,7 @@
         <w:tc>
           <w:tcPr>
             <w:tcW w:w="2955" w:type="dxa"/>
+            <w:vAlign w:val="center"/>
           </w:tcPr>
           <w:p>
             <w:pPr>
@@ -3015,6 +3010,7 @@
         <w:tc>
           <w:tcPr>
             <w:tcW w:w="2599" w:type="dxa"/>
+            <w:vAlign w:val="center"/>
           </w:tcPr>
           <w:p>
             <w:pPr>
@@ -3036,6 +3032,7 @@
         <w:tc>
           <w:tcPr>
             <w:tcW w:w="2597" w:type="dxa"/>
+            <w:vAlign w:val="center"/>
           </w:tcPr>
           <w:p>
             <w:pPr>
@@ -3051,6 +3048,7 @@
         <w:tc>
           <w:tcPr>
             <w:tcW w:w="2955" w:type="dxa"/>
+            <w:vAlign w:val="center"/>
           </w:tcPr>
           <w:p>
             <w:pPr>
@@ -3072,6 +3070,7 @@
         <w:tc>
           <w:tcPr>
             <w:tcW w:w="2599" w:type="dxa"/>
+            <w:vAlign w:val="center"/>
           </w:tcPr>
           <w:p>
             <w:pPr>
@@ -3090,6 +3089,7 @@
         <w:tc>
           <w:tcPr>
             <w:tcW w:w="2597" w:type="dxa"/>
+            <w:vAlign w:val="center"/>
           </w:tcPr>
           <w:p>
             <w:pPr>
@@ -3105,6 +3105,7 @@
         <w:tc>
           <w:tcPr>
             <w:tcW w:w="2955" w:type="dxa"/>
+            <w:vAlign w:val="center"/>
           </w:tcPr>
           <w:p>
             <w:pPr>
@@ -3113,18 +3114,36 @@
             <w:r>
               <w:t>INT</w:t>
             </w:r>
+            <w:r>
+              <w:t>EGER</w:t>
+            </w:r>
           </w:p>
         </w:tc>
         <w:tc>
           <w:tcPr>
             <w:tcW w:w="2599" w:type="dxa"/>
-          </w:tcPr>
-          <w:p>
-            <w:pPr>
-              <w:jc w:val="center"/>
-            </w:pPr>
-            <w:r>
-              <w:t>NOT NULL</w:t>
+            <w:vAlign w:val="center"/>
+          </w:tcPr>
+          <w:p>
+            <w:pPr>
+              <w:jc w:val="center"/>
+            </w:pPr>
+            <w:r>
+              <w:t xml:space="preserve">NOT </w:t>
+            </w:r>
+            <w:proofErr w:type="gramStart"/>
+            <w:r>
+              <w:t>NULL</w:t>
+            </w:r>
+            <w:r>
+              <w:t xml:space="preserve"> </w:t>
+            </w:r>
+            <w:r>
+              <w:t>,</w:t>
+            </w:r>
+            <w:proofErr w:type="gramEnd"/>
+            <w:r>
+              <w:t xml:space="preserve"> CHECK: 0–100</w:t>
             </w:r>
           </w:p>
         </w:tc>
@@ -3136,6 +3155,7 @@
         <w:tc>
           <w:tcPr>
             <w:tcW w:w="2597" w:type="dxa"/>
+            <w:vAlign w:val="center"/>
           </w:tcPr>
           <w:p>
             <w:pPr>
@@ -3151,26 +3171,42 @@
         <w:tc>
           <w:tcPr>
             <w:tcW w:w="2955" w:type="dxa"/>
-          </w:tcPr>
-          <w:p>
-            <w:pPr>
-              <w:jc w:val="center"/>
-            </w:pPr>
-            <w:r>
-              <w:t>INT</w:t>
+            <w:vAlign w:val="center"/>
+          </w:tcPr>
+          <w:p>
+            <w:pPr>
+              <w:jc w:val="center"/>
+            </w:pPr>
+            <w:r>
+              <w:t>INTEGER</w:t>
             </w:r>
           </w:p>
         </w:tc>
         <w:tc>
           <w:tcPr>
             <w:tcW w:w="2599" w:type="dxa"/>
-          </w:tcPr>
-          <w:p>
-            <w:pPr>
-              <w:jc w:val="center"/>
-            </w:pPr>
-            <w:r>
-              <w:t>NOT NULL</w:t>
+            <w:vAlign w:val="center"/>
+          </w:tcPr>
+          <w:p>
+            <w:pPr>
+              <w:jc w:val="center"/>
+            </w:pPr>
+            <w:r>
+              <w:t xml:space="preserve">NOT </w:t>
+            </w:r>
+            <w:proofErr w:type="gramStart"/>
+            <w:r>
+              <w:t>NULL</w:t>
+            </w:r>
+            <w:r>
+              <w:t xml:space="preserve"> </w:t>
+            </w:r>
+            <w:r>
+              <w:t>,</w:t>
+            </w:r>
+            <w:proofErr w:type="gramEnd"/>
+            <w:r>
+              <w:t xml:space="preserve"> CHECK: 0–100</w:t>
             </w:r>
           </w:p>
         </w:tc>
@@ -3182,6 +3218,7 @@
         <w:tc>
           <w:tcPr>
             <w:tcW w:w="2597" w:type="dxa"/>
+            <w:vAlign w:val="center"/>
           </w:tcPr>
           <w:p>
             <w:pPr>
@@ -3195,26 +3232,42 @@
         <w:tc>
           <w:tcPr>
             <w:tcW w:w="2955" w:type="dxa"/>
-          </w:tcPr>
-          <w:p>
-            <w:pPr>
-              <w:jc w:val="center"/>
-            </w:pPr>
-            <w:r>
-              <w:t>INT</w:t>
+            <w:vAlign w:val="center"/>
+          </w:tcPr>
+          <w:p>
+            <w:pPr>
+              <w:jc w:val="center"/>
+            </w:pPr>
+            <w:r>
+              <w:t>INTEGER</w:t>
             </w:r>
           </w:p>
         </w:tc>
         <w:tc>
           <w:tcPr>
             <w:tcW w:w="2599" w:type="dxa"/>
-          </w:tcPr>
-          <w:p>
-            <w:pPr>
-              <w:jc w:val="center"/>
-            </w:pPr>
-            <w:r>
-              <w:t>NOT NULL</w:t>
+            <w:vAlign w:val="center"/>
+          </w:tcPr>
+          <w:p>
+            <w:pPr>
+              <w:jc w:val="center"/>
+            </w:pPr>
+            <w:r>
+              <w:t xml:space="preserve">NOT </w:t>
+            </w:r>
+            <w:proofErr w:type="gramStart"/>
+            <w:r>
+              <w:t>NULL</w:t>
+            </w:r>
+            <w:r>
+              <w:t xml:space="preserve"> </w:t>
+            </w:r>
+            <w:r>
+              <w:t>,</w:t>
+            </w:r>
+            <w:proofErr w:type="gramEnd"/>
+            <w:r>
+              <w:t xml:space="preserve"> CHECK: 0–100</w:t>
             </w:r>
           </w:p>
         </w:tc>
@@ -3226,6 +3279,7 @@
         <w:tc>
           <w:tcPr>
             <w:tcW w:w="2597" w:type="dxa"/>
+            <w:vAlign w:val="center"/>
           </w:tcPr>
           <w:p>
             <w:pPr>
@@ -3239,26 +3293,42 @@
         <w:tc>
           <w:tcPr>
             <w:tcW w:w="2955" w:type="dxa"/>
-          </w:tcPr>
-          <w:p>
-            <w:pPr>
-              <w:jc w:val="center"/>
-            </w:pPr>
-            <w:r>
-              <w:t>INT</w:t>
+            <w:vAlign w:val="center"/>
+          </w:tcPr>
+          <w:p>
+            <w:pPr>
+              <w:jc w:val="center"/>
+            </w:pPr>
+            <w:r>
+              <w:t>INTEGER</w:t>
             </w:r>
           </w:p>
         </w:tc>
         <w:tc>
           <w:tcPr>
             <w:tcW w:w="2599" w:type="dxa"/>
-          </w:tcPr>
-          <w:p>
-            <w:pPr>
-              <w:jc w:val="center"/>
-            </w:pPr>
-            <w:r>
-              <w:t>NOT NULL</w:t>
+            <w:vAlign w:val="center"/>
+          </w:tcPr>
+          <w:p>
+            <w:pPr>
+              <w:jc w:val="center"/>
+            </w:pPr>
+            <w:r>
+              <w:t xml:space="preserve">NOT </w:t>
+            </w:r>
+            <w:proofErr w:type="gramStart"/>
+            <w:r>
+              <w:t>NULL</w:t>
+            </w:r>
+            <w:r>
+              <w:t xml:space="preserve"> </w:t>
+            </w:r>
+            <w:r>
+              <w:t>,</w:t>
+            </w:r>
+            <w:proofErr w:type="gramEnd"/>
+            <w:r>
+              <w:t xml:space="preserve"> CHECK: 0–100</w:t>
             </w:r>
           </w:p>
         </w:tc>
@@ -3270,6 +3340,7 @@
         <w:tc>
           <w:tcPr>
             <w:tcW w:w="2597" w:type="dxa"/>
+            <w:vAlign w:val="center"/>
           </w:tcPr>
           <w:p>
             <w:pPr>
@@ -3283,26 +3354,42 @@
         <w:tc>
           <w:tcPr>
             <w:tcW w:w="2955" w:type="dxa"/>
-          </w:tcPr>
-          <w:p>
-            <w:pPr>
-              <w:jc w:val="center"/>
-            </w:pPr>
-            <w:r>
-              <w:t>INT</w:t>
+            <w:vAlign w:val="center"/>
+          </w:tcPr>
+          <w:p>
+            <w:pPr>
+              <w:jc w:val="center"/>
+            </w:pPr>
+            <w:r>
+              <w:t>INTEGER</w:t>
             </w:r>
           </w:p>
         </w:tc>
         <w:tc>
           <w:tcPr>
             <w:tcW w:w="2599" w:type="dxa"/>
-          </w:tcPr>
-          <w:p>
-            <w:pPr>
-              <w:jc w:val="center"/>
-            </w:pPr>
-            <w:r>
-              <w:t>NOT NULL</w:t>
+            <w:vAlign w:val="center"/>
+          </w:tcPr>
+          <w:p>
+            <w:pPr>
+              <w:jc w:val="center"/>
+            </w:pPr>
+            <w:r>
+              <w:t xml:space="preserve">NOT </w:t>
+            </w:r>
+            <w:proofErr w:type="gramStart"/>
+            <w:r>
+              <w:t>NULL</w:t>
+            </w:r>
+            <w:r>
+              <w:t xml:space="preserve"> </w:t>
+            </w:r>
+            <w:r>
+              <w:t>,</w:t>
+            </w:r>
+            <w:proofErr w:type="gramEnd"/>
+            <w:r>
+              <w:t xml:space="preserve"> CHECK: 0–100</w:t>
             </w:r>
           </w:p>
         </w:tc>
@@ -3314,6 +3401,7 @@
         <w:tc>
           <w:tcPr>
             <w:tcW w:w="2597" w:type="dxa"/>
+            <w:vAlign w:val="center"/>
           </w:tcPr>
           <w:p>
             <w:pPr>
@@ -3327,29 +3415,42 @@
         <w:tc>
           <w:tcPr>
             <w:tcW w:w="2955" w:type="dxa"/>
-          </w:tcPr>
-          <w:p>
-            <w:pPr>
-              <w:jc w:val="center"/>
-            </w:pPr>
-            <w:r>
-              <w:t>INT</w:t>
+            <w:vAlign w:val="center"/>
+          </w:tcPr>
+          <w:p>
+            <w:pPr>
+              <w:jc w:val="center"/>
+            </w:pPr>
+            <w:r>
+              <w:t>INTEGER</w:t>
+            </w:r>
+          </w:p>
+        </w:tc>
+        <w:tc>
+          <w:tcPr>
+            <w:tcW w:w="2599" w:type="dxa"/>
+            <w:vAlign w:val="center"/>
+          </w:tcPr>
+          <w:p>
+            <w:pPr>
+              <w:jc w:val="center"/>
+            </w:pPr>
+            <w:r>
+              <w:t xml:space="preserve">NOT </w:t>
+            </w:r>
+            <w:proofErr w:type="gramStart"/>
+            <w:r>
+              <w:t>NULL</w:t>
             </w:r>
             <w:r>
               <w:t xml:space="preserve"> </w:t>
             </w:r>
-          </w:p>
-        </w:tc>
-        <w:tc>
-          <w:tcPr>
-            <w:tcW w:w="2599" w:type="dxa"/>
-          </w:tcPr>
-          <w:p>
-            <w:pPr>
-              <w:jc w:val="center"/>
-            </w:pPr>
-            <w:r>
-              <w:t>NOT NULL</w:t>
+            <w:r>
+              <w:t>,</w:t>
+            </w:r>
+            <w:proofErr w:type="gramEnd"/>
+            <w:r>
+              <w:t xml:space="preserve"> CHECK: 0–100</w:t>
             </w:r>
           </w:p>
         </w:tc>
@@ -3360,10 +3461,6 @@
       <w:tblPr>
         <w:tblStyle w:val="TableGrid"/>
         <w:tblW w:w="0" w:type="auto"/>
-        <w:tblBorders>
-          <w:insideH w:val="none" w:sz="0" w:space="0" w:color="auto"/>
-          <w:insideV w:val="none" w:sz="0" w:space="0" w:color="auto"/>
-        </w:tblBorders>
         <w:tblLook w:val="04A0" w:firstRow="1" w:lastRow="0" w:firstColumn="1" w:lastColumn="0" w:noHBand="0" w:noVBand="1"/>
       </w:tblPr>
       <w:tblGrid>
@@ -3379,10 +3476,7 @@
           <w:tcPr>
             <w:tcW w:w="7780" w:type="dxa"/>
             <w:gridSpan w:val="3"/>
-            <w:tcBorders>
-              <w:top w:val="single" w:sz="4" w:space="0" w:color="auto"/>
-              <w:bottom w:val="single" w:sz="4" w:space="0" w:color="4472C4" w:themeColor="accent1"/>
-            </w:tcBorders>
+            <w:vAlign w:val="center"/>
           </w:tcPr>
           <w:p>
             <w:pPr>
@@ -3401,9 +3495,7 @@
         <w:tc>
           <w:tcPr>
             <w:tcW w:w="2593" w:type="dxa"/>
-            <w:tcBorders>
-              <w:top w:val="single" w:sz="4" w:space="0" w:color="4472C4" w:themeColor="accent1"/>
-            </w:tcBorders>
+            <w:vAlign w:val="center"/>
           </w:tcPr>
           <w:p>
             <w:pPr>
@@ -3419,32 +3511,28 @@
         <w:tc>
           <w:tcPr>
             <w:tcW w:w="2593" w:type="dxa"/>
-            <w:tcBorders>
-              <w:top w:val="single" w:sz="4" w:space="0" w:color="4472C4" w:themeColor="accent1"/>
-            </w:tcBorders>
-          </w:tcPr>
-          <w:p>
-            <w:pPr>
-              <w:jc w:val="center"/>
-            </w:pPr>
-            <w:r>
-              <w:t>INT AUTO_INCREMENT</w:t>
+            <w:vAlign w:val="center"/>
+          </w:tcPr>
+          <w:p>
+            <w:pPr>
+              <w:jc w:val="center"/>
+            </w:pPr>
+            <w:r>
+              <w:t>INTEGER GENERATED ALWAYS AS IDENTITY</w:t>
             </w:r>
           </w:p>
         </w:tc>
         <w:tc>
           <w:tcPr>
             <w:tcW w:w="2594" w:type="dxa"/>
-            <w:tcBorders>
-              <w:top w:val="single" w:sz="4" w:space="0" w:color="4472C4" w:themeColor="accent1"/>
-            </w:tcBorders>
-          </w:tcPr>
-          <w:p>
-            <w:pPr>
-              <w:jc w:val="center"/>
-            </w:pPr>
-            <w:r>
-              <w:t>PK, NOT NULL</w:t>
+            <w:vAlign w:val="center"/>
+          </w:tcPr>
+          <w:p>
+            <w:pPr>
+              <w:jc w:val="center"/>
+            </w:pPr>
+            <w:r>
+              <w:t>PK</w:t>
             </w:r>
           </w:p>
         </w:tc>
@@ -3456,6 +3544,7 @@
         <w:tc>
           <w:tcPr>
             <w:tcW w:w="2593" w:type="dxa"/>
+            <w:vAlign w:val="center"/>
           </w:tcPr>
           <w:p>
             <w:pPr>
@@ -3471,6 +3560,7 @@
         <w:tc>
           <w:tcPr>
             <w:tcW w:w="2593" w:type="dxa"/>
+            <w:vAlign w:val="center"/>
           </w:tcPr>
           <w:p>
             <w:pPr>
@@ -3489,6 +3579,7 @@
         <w:tc>
           <w:tcPr>
             <w:tcW w:w="2594" w:type="dxa"/>
+            <w:vAlign w:val="center"/>
           </w:tcPr>
           <w:p>
             <w:pPr>
@@ -3510,19 +3601,21 @@
         <w:tc>
           <w:tcPr>
             <w:tcW w:w="2593" w:type="dxa"/>
-          </w:tcPr>
-          <w:p>
-            <w:pPr>
-              <w:jc w:val="center"/>
-            </w:pPr>
-            <w:r>
-              <w:t>Date</w:t>
+            <w:vAlign w:val="center"/>
+          </w:tcPr>
+          <w:p>
+            <w:pPr>
+              <w:jc w:val="center"/>
+            </w:pPr>
+            <w:r>
+              <w:t>ATTENDANCE_DATE</w:t>
             </w:r>
           </w:p>
         </w:tc>
         <w:tc>
           <w:tcPr>
             <w:tcW w:w="2593" w:type="dxa"/>
+            <w:vAlign w:val="center"/>
           </w:tcPr>
           <w:p>
             <w:pPr>
@@ -3536,6 +3629,7 @@
         <w:tc>
           <w:tcPr>
             <w:tcW w:w="2594" w:type="dxa"/>
+            <w:vAlign w:val="center"/>
           </w:tcPr>
           <w:p>
             <w:pPr>
@@ -3554,6 +3648,7 @@
         <w:tc>
           <w:tcPr>
             <w:tcW w:w="2593" w:type="dxa"/>
+            <w:vAlign w:val="center"/>
           </w:tcPr>
           <w:p>
             <w:pPr>
@@ -3567,24 +3662,19 @@
         <w:tc>
           <w:tcPr>
             <w:tcW w:w="2593" w:type="dxa"/>
-          </w:tcPr>
-          <w:p>
-            <w:pPr>
-              <w:jc w:val="center"/>
-            </w:pPr>
-            <w:r>
-              <w:t>ENUM(</w:t>
-            </w:r>
-            <w:r>
-              <w:t>'</w:t>
-            </w:r>
-            <w:proofErr w:type="spellStart"/>
-            <w:r>
-              <w:t>Present','Absent</w:t>
-            </w:r>
-            <w:proofErr w:type="spellEnd"/>
-            <w:r>
-              <w:t>'</w:t>
+            <w:vAlign w:val="center"/>
+          </w:tcPr>
+          <w:p>
+            <w:pPr>
+              <w:jc w:val="center"/>
+            </w:pPr>
+            <w:proofErr w:type="gramStart"/>
+            <w:r>
+              <w:t>VARCHAR(</w:t>
+            </w:r>
+            <w:proofErr w:type="gramEnd"/>
+            <w:r>
+              <w:t>10</w:t>
             </w:r>
             <w:r>
               <w:t>)</w:t>
@@ -3594,6 +3684,7 @@
         <w:tc>
           <w:tcPr>
             <w:tcW w:w="2594" w:type="dxa"/>
+            <w:vAlign w:val="center"/>
           </w:tcPr>
           <w:p>
             <w:pPr>
@@ -3601,6 +3692,12 @@
             </w:pPr>
             <w:r>
               <w:t>NOT NULL</w:t>
+            </w:r>
+            <w:r>
+              <w:t xml:space="preserve">, </w:t>
+            </w:r>
+            <w:r>
+              <w:t>CHECK: Present / Absent</w:t>
             </w:r>
           </w:p>
         </w:tc>
@@ -3611,10 +3708,7 @@
       <w:tblPr>
         <w:tblStyle w:val="TableGrid"/>
         <w:tblW w:w="0" w:type="auto"/>
-        <w:tblBorders>
-          <w:insideH w:val="none" w:sz="0" w:space="0" w:color="auto"/>
-          <w:insideV w:val="none" w:sz="0" w:space="0" w:color="auto"/>
-        </w:tblBorders>
+        <w:tblInd w:w="-5" w:type="dxa"/>
         <w:tblLook w:val="04A0" w:firstRow="1" w:lastRow="0" w:firstColumn="1" w:lastColumn="0" w:noHBand="0" w:noVBand="1"/>
       </w:tblPr>
       <w:tblGrid>
@@ -3630,10 +3724,6 @@
           <w:tcPr>
             <w:tcW w:w="8151" w:type="dxa"/>
             <w:gridSpan w:val="3"/>
-            <w:tcBorders>
-              <w:top w:val="single" w:sz="4" w:space="0" w:color="auto"/>
-              <w:bottom w:val="single" w:sz="4" w:space="0" w:color="4472C4" w:themeColor="accent1"/>
-            </w:tcBorders>
           </w:tcPr>
           <w:p>
             <w:pPr>
@@ -3652,9 +3742,7 @@
         <w:tc>
           <w:tcPr>
             <w:tcW w:w="2597" w:type="dxa"/>
-            <w:tcBorders>
-              <w:top w:val="single" w:sz="4" w:space="0" w:color="4472C4" w:themeColor="accent1"/>
-            </w:tcBorders>
+            <w:vAlign w:val="center"/>
           </w:tcPr>
           <w:p>
             <w:pPr>
@@ -3670,32 +3758,27 @@
         <w:tc>
           <w:tcPr>
             <w:tcW w:w="2955" w:type="dxa"/>
-            <w:tcBorders>
-              <w:top w:val="single" w:sz="4" w:space="0" w:color="4472C4" w:themeColor="accent1"/>
-            </w:tcBorders>
-          </w:tcPr>
-          <w:p>
-            <w:pPr>
-              <w:jc w:val="center"/>
-            </w:pPr>
-            <w:r>
-              <w:t>INT AUTO_INCREMENT</w:t>
+          </w:tcPr>
+          <w:p>
+            <w:pPr>
+              <w:jc w:val="center"/>
+            </w:pPr>
+            <w:r>
+              <w:t>INTEGER GENERATED ALWAYS AS IDENTITY</w:t>
             </w:r>
           </w:p>
         </w:tc>
         <w:tc>
           <w:tcPr>
             <w:tcW w:w="2599" w:type="dxa"/>
-            <w:tcBorders>
-              <w:top w:val="single" w:sz="4" w:space="0" w:color="4472C4" w:themeColor="accent1"/>
-            </w:tcBorders>
-          </w:tcPr>
-          <w:p>
-            <w:pPr>
-              <w:jc w:val="center"/>
-            </w:pPr>
-            <w:r>
-              <w:t>PK, NOT NULL</w:t>
+            <w:vAlign w:val="center"/>
+          </w:tcPr>
+          <w:p>
+            <w:pPr>
+              <w:jc w:val="center"/>
+            </w:pPr>
+            <w:r>
+              <w:t>PK</w:t>
             </w:r>
           </w:p>
         </w:tc>
@@ -3728,7 +3811,7 @@
               <w:jc w:val="center"/>
             </w:pPr>
             <w:r>
-              <w:t>INT</w:t>
+              <w:t>INTEGER</w:t>
             </w:r>
           </w:p>
         </w:tc>
@@ -3799,151 +3882,6 @@
             </w:r>
             <w:r>
               <w:t>K, NOT NULL</w:t>
-            </w:r>
-          </w:p>
-        </w:tc>
-      </w:tr>
-      <w:tr>
-        <w:trPr>
-          <w:trHeight w:val="271"/>
-        </w:trPr>
-        <w:tc>
-          <w:tcPr>
-            <w:tcW w:w="2597" w:type="dxa"/>
-          </w:tcPr>
-          <w:p>
-            <w:pPr>
-              <w:jc w:val="center"/>
-            </w:pPr>
-            <w:proofErr w:type="spellStart"/>
-            <w:r>
-              <w:t>TotalMarks</w:t>
-            </w:r>
-            <w:proofErr w:type="spellEnd"/>
-          </w:p>
-        </w:tc>
-        <w:tc>
-          <w:tcPr>
-            <w:tcW w:w="2955" w:type="dxa"/>
-          </w:tcPr>
-          <w:p>
-            <w:pPr>
-              <w:jc w:val="center"/>
-            </w:pPr>
-            <w:r>
-              <w:t>INT</w:t>
-            </w:r>
-          </w:p>
-        </w:tc>
-        <w:tc>
-          <w:tcPr>
-            <w:tcW w:w="2599" w:type="dxa"/>
-          </w:tcPr>
-          <w:p>
-            <w:pPr>
-              <w:jc w:val="center"/>
-            </w:pPr>
-            <w:r>
-              <w:t>Derived</w:t>
-            </w:r>
-          </w:p>
-        </w:tc>
-      </w:tr>
-      <w:tr>
-        <w:trPr>
-          <w:trHeight w:val="271"/>
-        </w:trPr>
-        <w:tc>
-          <w:tcPr>
-            <w:tcW w:w="2597" w:type="dxa"/>
-          </w:tcPr>
-          <w:p>
-            <w:pPr>
-              <w:jc w:val="center"/>
-            </w:pPr>
-            <w:r>
-              <w:t>Average</w:t>
-            </w:r>
-          </w:p>
-        </w:tc>
-        <w:tc>
-          <w:tcPr>
-            <w:tcW w:w="2955" w:type="dxa"/>
-          </w:tcPr>
-          <w:p>
-            <w:pPr>
-              <w:jc w:val="center"/>
-            </w:pPr>
-            <w:proofErr w:type="gramStart"/>
-            <w:r>
-              <w:t>DECIMAL(</w:t>
-            </w:r>
-            <w:proofErr w:type="gramEnd"/>
-            <w:r>
-              <w:t>5,2)</w:t>
-            </w:r>
-          </w:p>
-        </w:tc>
-        <w:tc>
-          <w:tcPr>
-            <w:tcW w:w="2599" w:type="dxa"/>
-          </w:tcPr>
-          <w:p>
-            <w:pPr>
-              <w:jc w:val="center"/>
-            </w:pPr>
-            <w:r>
-              <w:t>Derived</w:t>
-            </w:r>
-          </w:p>
-        </w:tc>
-      </w:tr>
-      <w:tr>
-        <w:trPr>
-          <w:trHeight w:val="283"/>
-        </w:trPr>
-        <w:tc>
-          <w:tcPr>
-            <w:tcW w:w="2597" w:type="dxa"/>
-          </w:tcPr>
-          <w:p>
-            <w:pPr>
-              <w:jc w:val="center"/>
-            </w:pPr>
-            <w:r>
-              <w:t>Grade</w:t>
-            </w:r>
-          </w:p>
-        </w:tc>
-        <w:tc>
-          <w:tcPr>
-            <w:tcW w:w="2955" w:type="dxa"/>
-          </w:tcPr>
-          <w:p>
-            <w:pPr>
-              <w:jc w:val="center"/>
-            </w:pPr>
-            <w:r>
-              <w:t>ENUM(</w:t>
-            </w:r>
-            <w:r>
-              <w:t>'A+','A','B','C','D','F'</w:t>
-            </w:r>
-            <w:r>
-              <w:t>)</w:t>
-            </w:r>
-          </w:p>
-        </w:tc>
-        <w:tc>
-          <w:tcPr>
-            <w:tcW w:w="2599" w:type="dxa"/>
-          </w:tcPr>
-          <w:p>
-            <w:pPr>
-              <w:jc w:val="center"/>
-            </w:pPr>
-            <w:r>
-              <w:t>Derived</w:t>
             </w:r>
           </w:p>
         </w:tc>
@@ -3954,10 +3892,6 @@
       <w:tblPr>
         <w:tblStyle w:val="TableGrid"/>
         <w:tblW w:w="0" w:type="auto"/>
-        <w:tblBorders>
-          <w:insideH w:val="none" w:sz="0" w:space="0" w:color="auto"/>
-          <w:insideV w:val="none" w:sz="0" w:space="0" w:color="auto"/>
-        </w:tblBorders>
         <w:tblLook w:val="04A0" w:firstRow="1" w:lastRow="0" w:firstColumn="1" w:lastColumn="0" w:noHBand="0" w:noVBand="1"/>
       </w:tblPr>
       <w:tblGrid>
@@ -3973,10 +3907,7 @@
           <w:tcPr>
             <w:tcW w:w="8316" w:type="dxa"/>
             <w:gridSpan w:val="3"/>
-            <w:tcBorders>
-              <w:top w:val="single" w:sz="4" w:space="0" w:color="auto"/>
-              <w:bottom w:val="single" w:sz="4" w:space="0" w:color="4472C4" w:themeColor="accent1"/>
-            </w:tcBorders>
+            <w:vAlign w:val="center"/>
           </w:tcPr>
           <w:p>
             <w:pPr>
@@ -3995,9 +3926,7 @@
         <w:tc>
           <w:tcPr>
             <w:tcW w:w="2597" w:type="dxa"/>
-            <w:tcBorders>
-              <w:top w:val="single" w:sz="4" w:space="0" w:color="4472C4" w:themeColor="accent1"/>
-            </w:tcBorders>
+            <w:vAlign w:val="center"/>
           </w:tcPr>
           <w:p>
             <w:pPr>
@@ -4011,9 +3940,7 @@
         <w:tc>
           <w:tcPr>
             <w:tcW w:w="2955" w:type="dxa"/>
-            <w:tcBorders>
-              <w:top w:val="single" w:sz="4" w:space="0" w:color="4472C4" w:themeColor="accent1"/>
-            </w:tcBorders>
+            <w:vAlign w:val="center"/>
           </w:tcPr>
           <w:p>
             <w:pPr>
@@ -4027,9 +3954,7 @@
         <w:tc>
           <w:tcPr>
             <w:tcW w:w="2764" w:type="dxa"/>
-            <w:tcBorders>
-              <w:top w:val="single" w:sz="4" w:space="0" w:color="4472C4" w:themeColor="accent1"/>
-            </w:tcBorders>
+            <w:vAlign w:val="center"/>
           </w:tcPr>
           <w:p>
             <w:pPr>
@@ -4048,6 +3973,7 @@
         <w:tc>
           <w:tcPr>
             <w:tcW w:w="2597" w:type="dxa"/>
+            <w:vAlign w:val="center"/>
           </w:tcPr>
           <w:p>
             <w:pPr>
@@ -4061,6 +3987,7 @@
         <w:tc>
           <w:tcPr>
             <w:tcW w:w="2955" w:type="dxa"/>
+            <w:vAlign w:val="center"/>
           </w:tcPr>
           <w:p>
             <w:pPr>
@@ -4076,6 +4003,7 @@
         <w:tc>
           <w:tcPr>
             <w:tcW w:w="2764" w:type="dxa"/>
+            <w:vAlign w:val="center"/>
           </w:tcPr>
           <w:p>
             <w:pPr>
@@ -4102,6 +4030,7 @@
         <w:tc>
           <w:tcPr>
             <w:tcW w:w="2597" w:type="dxa"/>
+            <w:vAlign w:val="center"/>
           </w:tcPr>
           <w:p>
             <w:pPr>
@@ -4115,6 +4044,7 @@
         <w:tc>
           <w:tcPr>
             <w:tcW w:w="2955" w:type="dxa"/>
+            <w:vAlign w:val="center"/>
           </w:tcPr>
           <w:p>
             <w:pPr>
@@ -4130,21 +4060,14 @@
         <w:tc>
           <w:tcPr>
             <w:tcW w:w="2764" w:type="dxa"/>
-          </w:tcPr>
-          <w:p>
-            <w:pPr>
-              <w:jc w:val="center"/>
-            </w:pPr>
-            <w:r>
-              <w:t>STUDENT(</w:t>
-            </w:r>
-            <w:proofErr w:type="spellStart"/>
-            <w:r>
-              <w:t>RegNo</w:t>
-            </w:r>
-            <w:proofErr w:type="spellEnd"/>
-            <w:r>
-              <w:t>)</w:t>
+            <w:vAlign w:val="center"/>
+          </w:tcPr>
+          <w:p>
+            <w:pPr>
+              <w:jc w:val="center"/>
+            </w:pPr>
+            <w:r>
+              <w:t>STUDENT(RegNo)</w:t>
             </w:r>
           </w:p>
         </w:tc>
@@ -4156,6 +4079,7 @@
         <w:tc>
           <w:tcPr>
             <w:tcW w:w="2597" w:type="dxa"/>
+            <w:vAlign w:val="center"/>
           </w:tcPr>
           <w:p>
             <w:pPr>
@@ -4169,6 +4093,7 @@
         <w:tc>
           <w:tcPr>
             <w:tcW w:w="2955" w:type="dxa"/>
+            <w:vAlign w:val="center"/>
           </w:tcPr>
           <w:p>
             <w:pPr>
@@ -4184,21 +4109,14 @@
         <w:tc>
           <w:tcPr>
             <w:tcW w:w="2764" w:type="dxa"/>
-          </w:tcPr>
-          <w:p>
-            <w:pPr>
-              <w:jc w:val="center"/>
-            </w:pPr>
-            <w:r>
-              <w:t>STUDENT(</w:t>
-            </w:r>
-            <w:proofErr w:type="spellStart"/>
-            <w:r>
-              <w:t>RegNo</w:t>
-            </w:r>
-            <w:proofErr w:type="spellEnd"/>
-            <w:r>
-              <w:t>)</w:t>
+            <w:vAlign w:val="center"/>
+          </w:tcPr>
+          <w:p>
+            <w:pPr>
+              <w:jc w:val="center"/>
+            </w:pPr>
+            <w:r>
+              <w:t>STUDENT(RegNo)</w:t>
             </w:r>
           </w:p>
         </w:tc>
@@ -4210,6 +4128,7 @@
         <w:tc>
           <w:tcPr>
             <w:tcW w:w="2597" w:type="dxa"/>
+            <w:vAlign w:val="center"/>
           </w:tcPr>
           <w:p>
             <w:pPr>
@@ -4223,6 +4142,7 @@
         <w:tc>
           <w:tcPr>
             <w:tcW w:w="2955" w:type="dxa"/>
+            <w:vAlign w:val="center"/>
           </w:tcPr>
           <w:p>
             <w:pPr>
@@ -4238,6 +4158,7 @@
         <w:tc>
           <w:tcPr>
             <w:tcW w:w="2764" w:type="dxa"/>
+            <w:vAlign w:val="center"/>
           </w:tcPr>
           <w:p>
             <w:pPr>
@@ -4264,6 +4185,7 @@
         <w:tc>
           <w:tcPr>
             <w:tcW w:w="2597" w:type="dxa"/>
+            <w:vAlign w:val="center"/>
           </w:tcPr>
           <w:p>
             <w:pPr>
@@ -4277,6 +4199,7 @@
         <w:tc>
           <w:tcPr>
             <w:tcW w:w="2955" w:type="dxa"/>
+            <w:vAlign w:val="center"/>
           </w:tcPr>
           <w:p>
             <w:pPr>
@@ -4292,21 +4215,1062 @@
         <w:tc>
           <w:tcPr>
             <w:tcW w:w="2764" w:type="dxa"/>
-          </w:tcPr>
-          <w:p>
-            <w:pPr>
-              <w:jc w:val="center"/>
-            </w:pPr>
-            <w:r>
-              <w:t>STUDENT(</w:t>
-            </w:r>
+            <w:vAlign w:val="center"/>
+          </w:tcPr>
+          <w:p>
+            <w:pPr>
+              <w:jc w:val="center"/>
+            </w:pPr>
+            <w:r>
+              <w:t>STUDENT(RegNo)</w:t>
+            </w:r>
+          </w:p>
+        </w:tc>
+      </w:tr>
+    </w:tbl>
+    <w:p>
+      <w:pPr>
+        <w:rPr>
+          <w:rFonts w:ascii="Times New Roman" w:hAnsi="Times New Roman" w:cs="Times New Roman"/>
+          <w:sz w:val="26"/>
+          <w:szCs w:val="26"/>
+        </w:rPr>
+      </w:pPr>
+    </w:p>
+    <w:tbl>
+      <w:tblPr>
+        <w:tblStyle w:val="TableGrid"/>
+        <w:tblW w:w="0" w:type="auto"/>
+        <w:tblInd w:w="-5" w:type="dxa"/>
+        <w:tblLook w:val="04A0" w:firstRow="1" w:lastRow="0" w:firstColumn="1" w:lastColumn="0" w:noHBand="0" w:noVBand="1"/>
+      </w:tblPr>
+      <w:tblGrid>
+        <w:gridCol w:w="2597"/>
+        <w:gridCol w:w="2955"/>
+        <w:gridCol w:w="2599"/>
+      </w:tblGrid>
+      <w:tr>
+        <w:trPr>
+          <w:trHeight w:val="271"/>
+        </w:trPr>
+        <w:tc>
+          <w:tcPr>
+            <w:tcW w:w="8151" w:type="dxa"/>
+            <w:gridSpan w:val="3"/>
+            <w:vAlign w:val="center"/>
+          </w:tcPr>
+          <w:p>
+            <w:pPr>
+              <w:jc w:val="center"/>
+            </w:pPr>
+            <w:r>
+              <w:t>STUDENT_REPORTS (VIEW)</w:t>
+            </w:r>
+          </w:p>
+        </w:tc>
+      </w:tr>
+      <w:tr>
+        <w:trPr>
+          <w:trHeight w:val="271"/>
+        </w:trPr>
+        <w:tc>
+          <w:tcPr>
+            <w:tcW w:w="2597" w:type="dxa"/>
+            <w:vAlign w:val="center"/>
+          </w:tcPr>
+          <w:p>
+            <w:pPr>
+              <w:jc w:val="center"/>
+            </w:pPr>
             <w:proofErr w:type="spellStart"/>
             <w:r>
+              <w:t>ReportID</w:t>
+            </w:r>
+            <w:proofErr w:type="spellEnd"/>
+          </w:p>
+        </w:tc>
+        <w:tc>
+          <w:tcPr>
+            <w:tcW w:w="2955" w:type="dxa"/>
+            <w:vAlign w:val="center"/>
+          </w:tcPr>
+          <w:p>
+            <w:pPr>
+              <w:jc w:val="center"/>
+            </w:pPr>
+            <w:r>
+              <w:t>INTEGER GENERATED ALWAYS AS IDENTITY</w:t>
+            </w:r>
+          </w:p>
+        </w:tc>
+        <w:tc>
+          <w:tcPr>
+            <w:tcW w:w="2599" w:type="dxa"/>
+            <w:vAlign w:val="center"/>
+          </w:tcPr>
+          <w:p>
+            <w:pPr>
+              <w:jc w:val="center"/>
+            </w:pPr>
+            <w:r>
+              <w:t>PK</w:t>
+            </w:r>
+          </w:p>
+        </w:tc>
+      </w:tr>
+      <w:tr>
+        <w:trPr>
+          <w:trHeight w:val="283"/>
+        </w:trPr>
+        <w:tc>
+          <w:tcPr>
+            <w:tcW w:w="2597" w:type="dxa"/>
+            <w:vAlign w:val="center"/>
+          </w:tcPr>
+          <w:p>
+            <w:pPr>
+              <w:jc w:val="center"/>
+            </w:pPr>
+            <w:proofErr w:type="spellStart"/>
+            <w:r>
+              <w:t>MarkID</w:t>
+            </w:r>
+            <w:proofErr w:type="spellEnd"/>
+          </w:p>
+        </w:tc>
+        <w:tc>
+          <w:tcPr>
+            <w:tcW w:w="2955" w:type="dxa"/>
+            <w:vAlign w:val="center"/>
+          </w:tcPr>
+          <w:p>
+            <w:pPr>
+              <w:jc w:val="center"/>
+            </w:pPr>
+            <w:r>
+              <w:t>INTEGER</w:t>
+            </w:r>
+          </w:p>
+        </w:tc>
+        <w:tc>
+          <w:tcPr>
+            <w:tcW w:w="2599" w:type="dxa"/>
+            <w:vAlign w:val="center"/>
+          </w:tcPr>
+          <w:p>
+            <w:pPr>
+              <w:jc w:val="center"/>
+            </w:pPr>
+            <w:r>
+              <w:t>F</w:t>
+            </w:r>
+            <w:r>
+              <w:t>K, NOT NULL</w:t>
+            </w:r>
+          </w:p>
+        </w:tc>
+      </w:tr>
+      <w:tr>
+        <w:trPr>
+          <w:trHeight w:val="271"/>
+        </w:trPr>
+        <w:tc>
+          <w:tcPr>
+            <w:tcW w:w="2597" w:type="dxa"/>
+            <w:vAlign w:val="center"/>
+          </w:tcPr>
+          <w:p>
+            <w:pPr>
+              <w:jc w:val="center"/>
+            </w:pPr>
+            <w:proofErr w:type="spellStart"/>
+            <w:r>
               <w:t>RegNo</w:t>
             </w:r>
             <w:proofErr w:type="spellEnd"/>
+          </w:p>
+        </w:tc>
+        <w:tc>
+          <w:tcPr>
+            <w:tcW w:w="2955" w:type="dxa"/>
+            <w:vAlign w:val="center"/>
+          </w:tcPr>
+          <w:p>
+            <w:pPr>
+              <w:jc w:val="center"/>
+            </w:pPr>
+            <w:proofErr w:type="gramStart"/>
+            <w:r>
+              <w:t>VARCHAR(</w:t>
+            </w:r>
+            <w:proofErr w:type="gramEnd"/>
+            <w:r>
+              <w:t>15)</w:t>
+            </w:r>
+          </w:p>
+        </w:tc>
+        <w:tc>
+          <w:tcPr>
+            <w:tcW w:w="2599" w:type="dxa"/>
+            <w:vAlign w:val="center"/>
+          </w:tcPr>
+          <w:p>
+            <w:pPr>
+              <w:jc w:val="center"/>
+            </w:pPr>
+            <w:r>
+              <w:t>F</w:t>
+            </w:r>
+            <w:r>
+              <w:t>K, NOT NULL</w:t>
+            </w:r>
+          </w:p>
+        </w:tc>
+      </w:tr>
+      <w:tr>
+        <w:trPr>
+          <w:trHeight w:val="271"/>
+        </w:trPr>
+        <w:tc>
+          <w:tcPr>
+            <w:tcW w:w="2597" w:type="dxa"/>
+            <w:vAlign w:val="center"/>
+          </w:tcPr>
+          <w:p>
+            <w:pPr>
+              <w:jc w:val="center"/>
+            </w:pPr>
+            <w:proofErr w:type="spellStart"/>
+            <w:r>
+              <w:t>TotalMarks</w:t>
+            </w:r>
+            <w:proofErr w:type="spellEnd"/>
+          </w:p>
+        </w:tc>
+        <w:tc>
+          <w:tcPr>
+            <w:tcW w:w="2955" w:type="dxa"/>
+            <w:vAlign w:val="center"/>
+          </w:tcPr>
+          <w:p>
+            <w:pPr>
+              <w:jc w:val="center"/>
+            </w:pPr>
+            <w:r>
+              <w:t>INTEGER</w:t>
+            </w:r>
+          </w:p>
+        </w:tc>
+        <w:tc>
+          <w:tcPr>
+            <w:tcW w:w="2599" w:type="dxa"/>
+            <w:vAlign w:val="center"/>
+          </w:tcPr>
+          <w:p>
+            <w:pPr>
+              <w:jc w:val="center"/>
+            </w:pPr>
+            <w:r>
+              <w:t>Derived</w:t>
+            </w:r>
+          </w:p>
+        </w:tc>
+      </w:tr>
+      <w:tr>
+        <w:trPr>
+          <w:trHeight w:val="271"/>
+        </w:trPr>
+        <w:tc>
+          <w:tcPr>
+            <w:tcW w:w="2597" w:type="dxa"/>
+            <w:vAlign w:val="center"/>
+          </w:tcPr>
+          <w:p>
+            <w:pPr>
+              <w:jc w:val="center"/>
+            </w:pPr>
+            <w:r>
+              <w:t>Average</w:t>
+            </w:r>
+          </w:p>
+        </w:tc>
+        <w:tc>
+          <w:tcPr>
+            <w:tcW w:w="2955" w:type="dxa"/>
+            <w:vAlign w:val="center"/>
+          </w:tcPr>
+          <w:p>
+            <w:pPr>
+              <w:jc w:val="center"/>
+            </w:pPr>
+            <w:proofErr w:type="gramStart"/>
+            <w:r>
+              <w:t>DECIMAL(</w:t>
+            </w:r>
+            <w:proofErr w:type="gramEnd"/>
+            <w:r>
+              <w:t>5,2)</w:t>
+            </w:r>
+          </w:p>
+        </w:tc>
+        <w:tc>
+          <w:tcPr>
+            <w:tcW w:w="2599" w:type="dxa"/>
+            <w:vAlign w:val="center"/>
+          </w:tcPr>
+          <w:p>
+            <w:pPr>
+              <w:jc w:val="center"/>
+            </w:pPr>
+            <w:r>
+              <w:t>Derived</w:t>
+            </w:r>
+          </w:p>
+        </w:tc>
+      </w:tr>
+      <w:tr>
+        <w:trPr>
+          <w:trHeight w:val="283"/>
+        </w:trPr>
+        <w:tc>
+          <w:tcPr>
+            <w:tcW w:w="2597" w:type="dxa"/>
+            <w:vAlign w:val="center"/>
+          </w:tcPr>
+          <w:p>
+            <w:pPr>
+              <w:jc w:val="center"/>
+            </w:pPr>
+            <w:r>
+              <w:t>Grade</w:t>
+            </w:r>
+          </w:p>
+        </w:tc>
+        <w:tc>
+          <w:tcPr>
+            <w:tcW w:w="2955" w:type="dxa"/>
+            <w:vAlign w:val="center"/>
+          </w:tcPr>
+          <w:p>
+            <w:pPr>
+              <w:jc w:val="center"/>
+            </w:pPr>
+            <w:r>
+              <w:t>ENUM(</w:t>
+            </w:r>
+            <w:r>
+              <w:t>'A+','A','B','C','D','F'</w:t>
+            </w:r>
             <w:r>
               <w:t>)</w:t>
+            </w:r>
+          </w:p>
+        </w:tc>
+        <w:tc>
+          <w:tcPr>
+            <w:tcW w:w="2599" w:type="dxa"/>
+            <w:vAlign w:val="center"/>
+          </w:tcPr>
+          <w:p>
+            <w:pPr>
+              <w:jc w:val="center"/>
+            </w:pPr>
+            <w:r>
+              <w:t>Derived</w:t>
+            </w:r>
+          </w:p>
+        </w:tc>
+      </w:tr>
+    </w:tbl>
+    <w:p>
+      <w:pPr>
+        <w:rPr>
+          <w:rFonts w:ascii="Times New Roman" w:hAnsi="Times New Roman" w:cs="Times New Roman"/>
+          <w:sz w:val="26"/>
+          <w:szCs w:val="26"/>
+        </w:rPr>
+      </w:pPr>
+    </w:p>
+    <w:p>
+      <w:pPr>
+        <w:rPr>
+          <w:rFonts w:ascii="Times New Roman" w:hAnsi="Times New Roman" w:cs="Times New Roman"/>
+          <w:sz w:val="26"/>
+          <w:szCs w:val="26"/>
+        </w:rPr>
+      </w:pPr>
+    </w:p>
+    <w:tbl>
+      <w:tblPr>
+        <w:tblStyle w:val="TableGrid"/>
+        <w:tblW w:w="0" w:type="auto"/>
+        <w:tblInd w:w="-5" w:type="dxa"/>
+        <w:tblLook w:val="04A0" w:firstRow="1" w:lastRow="0" w:firstColumn="1" w:lastColumn="0" w:noHBand="0" w:noVBand="1"/>
+      </w:tblPr>
+      <w:tblGrid>
+        <w:gridCol w:w="2597"/>
+        <w:gridCol w:w="2955"/>
+        <w:gridCol w:w="2599"/>
+      </w:tblGrid>
+      <w:tr>
+        <w:trPr>
+          <w:trHeight w:val="271"/>
+        </w:trPr>
+        <w:tc>
+          <w:tcPr>
+            <w:tcW w:w="8151" w:type="dxa"/>
+            <w:gridSpan w:val="3"/>
+            <w:vAlign w:val="center"/>
+          </w:tcPr>
+          <w:p>
+            <w:pPr>
+              <w:jc w:val="center"/>
+            </w:pPr>
+            <w:r>
+              <w:lastRenderedPageBreak/>
+              <w:t>STUDENT_</w:t>
+            </w:r>
+            <w:r>
+              <w:t>DETAILS</w:t>
+            </w:r>
+            <w:r>
+              <w:t xml:space="preserve"> (VIEW)</w:t>
+            </w:r>
+          </w:p>
+        </w:tc>
+      </w:tr>
+      <w:tr>
+        <w:trPr>
+          <w:trHeight w:val="271"/>
+        </w:trPr>
+        <w:tc>
+          <w:tcPr>
+            <w:tcW w:w="2597" w:type="dxa"/>
+            <w:vAlign w:val="center"/>
+          </w:tcPr>
+          <w:p>
+            <w:pPr>
+              <w:jc w:val="center"/>
+            </w:pPr>
+            <w:proofErr w:type="spellStart"/>
+            <w:r>
+              <w:t>RegNo</w:t>
+            </w:r>
+            <w:proofErr w:type="spellEnd"/>
+          </w:p>
+        </w:tc>
+        <w:tc>
+          <w:tcPr>
+            <w:tcW w:w="2955" w:type="dxa"/>
+            <w:vAlign w:val="center"/>
+          </w:tcPr>
+          <w:p>
+            <w:pPr>
+              <w:jc w:val="center"/>
+            </w:pPr>
+            <w:proofErr w:type="gramStart"/>
+            <w:r>
+              <w:t>VARCHAR(</w:t>
+            </w:r>
+            <w:proofErr w:type="gramEnd"/>
+            <w:r>
+              <w:t>1</w:t>
+            </w:r>
+            <w:r>
+              <w:t>5</w:t>
+            </w:r>
+            <w:r>
+              <w:t>)</w:t>
+            </w:r>
+          </w:p>
+        </w:tc>
+        <w:tc>
+          <w:tcPr>
+            <w:tcW w:w="2599" w:type="dxa"/>
+            <w:vAlign w:val="center"/>
+          </w:tcPr>
+          <w:p>
+            <w:pPr>
+              <w:jc w:val="center"/>
+            </w:pPr>
+            <w:r>
+              <w:t>—</w:t>
+            </w:r>
+          </w:p>
+        </w:tc>
+      </w:tr>
+      <w:tr>
+        <w:trPr>
+          <w:trHeight w:val="271"/>
+        </w:trPr>
+        <w:tc>
+          <w:tcPr>
+            <w:tcW w:w="2597" w:type="dxa"/>
+            <w:vAlign w:val="center"/>
+          </w:tcPr>
+          <w:p>
+            <w:pPr>
+              <w:jc w:val="center"/>
+            </w:pPr>
+            <w:proofErr w:type="spellStart"/>
+            <w:r>
+              <w:t>FullName</w:t>
+            </w:r>
+            <w:proofErr w:type="spellEnd"/>
+          </w:p>
+        </w:tc>
+        <w:tc>
+          <w:tcPr>
+            <w:tcW w:w="2955" w:type="dxa"/>
+            <w:vAlign w:val="center"/>
+          </w:tcPr>
+          <w:p>
+            <w:pPr>
+              <w:jc w:val="center"/>
+            </w:pPr>
+            <w:proofErr w:type="gramStart"/>
+            <w:r>
+              <w:t>VARCHAR(</w:t>
+            </w:r>
+            <w:proofErr w:type="gramEnd"/>
+            <w:r>
+              <w:t>100)</w:t>
+            </w:r>
+          </w:p>
+        </w:tc>
+        <w:tc>
+          <w:tcPr>
+            <w:tcW w:w="2599" w:type="dxa"/>
+            <w:vAlign w:val="center"/>
+          </w:tcPr>
+          <w:p>
+            <w:pPr>
+              <w:jc w:val="center"/>
+            </w:pPr>
+            <w:r>
+              <w:t>—</w:t>
+            </w:r>
+          </w:p>
+        </w:tc>
+      </w:tr>
+      <w:tr>
+        <w:trPr>
+          <w:trHeight w:val="271"/>
+        </w:trPr>
+        <w:tc>
+          <w:tcPr>
+            <w:tcW w:w="2597" w:type="dxa"/>
+            <w:vAlign w:val="center"/>
+          </w:tcPr>
+          <w:p>
+            <w:pPr>
+              <w:jc w:val="center"/>
+            </w:pPr>
+            <w:r>
+              <w:t>Class</w:t>
+            </w:r>
+          </w:p>
+        </w:tc>
+        <w:tc>
+          <w:tcPr>
+            <w:tcW w:w="2955" w:type="dxa"/>
+            <w:vAlign w:val="center"/>
+          </w:tcPr>
+          <w:p>
+            <w:pPr>
+              <w:jc w:val="center"/>
+            </w:pPr>
+            <w:proofErr w:type="gramStart"/>
+            <w:r>
+              <w:t>VARCHAR(</w:t>
+            </w:r>
+            <w:proofErr w:type="gramEnd"/>
+            <w:r>
+              <w:t>20)</w:t>
+            </w:r>
+          </w:p>
+        </w:tc>
+        <w:tc>
+          <w:tcPr>
+            <w:tcW w:w="2599" w:type="dxa"/>
+            <w:vAlign w:val="center"/>
+          </w:tcPr>
+          <w:p>
+            <w:pPr>
+              <w:jc w:val="center"/>
+            </w:pPr>
+            <w:r>
+              <w:t>—</w:t>
+            </w:r>
+          </w:p>
+        </w:tc>
+      </w:tr>
+      <w:tr>
+        <w:trPr>
+          <w:trHeight w:val="283"/>
+        </w:trPr>
+        <w:tc>
+          <w:tcPr>
+            <w:tcW w:w="2597" w:type="dxa"/>
+            <w:vAlign w:val="center"/>
+          </w:tcPr>
+          <w:p>
+            <w:pPr>
+              <w:jc w:val="center"/>
+            </w:pPr>
+            <w:proofErr w:type="spellStart"/>
+            <w:r>
+              <w:t>DateOfBirth</w:t>
+            </w:r>
+            <w:proofErr w:type="spellEnd"/>
+          </w:p>
+        </w:tc>
+        <w:tc>
+          <w:tcPr>
+            <w:tcW w:w="2955" w:type="dxa"/>
+            <w:vAlign w:val="center"/>
+          </w:tcPr>
+          <w:p>
+            <w:pPr>
+              <w:jc w:val="center"/>
+            </w:pPr>
+            <w:r>
+              <w:t>DATE</w:t>
+            </w:r>
+          </w:p>
+        </w:tc>
+        <w:tc>
+          <w:tcPr>
+            <w:tcW w:w="2599" w:type="dxa"/>
+            <w:vAlign w:val="center"/>
+          </w:tcPr>
+          <w:p>
+            <w:pPr>
+              <w:jc w:val="center"/>
+            </w:pPr>
+            <w:r>
+              <w:t>—</w:t>
+            </w:r>
+          </w:p>
+        </w:tc>
+      </w:tr>
+      <w:tr>
+        <w:trPr>
+          <w:trHeight w:val="283"/>
+        </w:trPr>
+        <w:tc>
+          <w:tcPr>
+            <w:tcW w:w="2597" w:type="dxa"/>
+            <w:vAlign w:val="center"/>
+          </w:tcPr>
+          <w:p>
+            <w:pPr>
+              <w:jc w:val="center"/>
+            </w:pPr>
+            <w:r>
+              <w:t>Gender</w:t>
+            </w:r>
+          </w:p>
+        </w:tc>
+        <w:tc>
+          <w:tcPr>
+            <w:tcW w:w="2955" w:type="dxa"/>
+            <w:vAlign w:val="center"/>
+          </w:tcPr>
+          <w:p>
+            <w:pPr>
+              <w:jc w:val="center"/>
+            </w:pPr>
+            <w:proofErr w:type="gramStart"/>
+            <w:r>
+              <w:t>VARCHAR(</w:t>
+            </w:r>
+            <w:proofErr w:type="gramEnd"/>
+            <w:r>
+              <w:t>10)</w:t>
+            </w:r>
+          </w:p>
+        </w:tc>
+        <w:tc>
+          <w:tcPr>
+            <w:tcW w:w="2599" w:type="dxa"/>
+            <w:vAlign w:val="center"/>
+          </w:tcPr>
+          <w:p>
+            <w:pPr>
+              <w:jc w:val="center"/>
+            </w:pPr>
+            <w:r>
+              <w:t>—</w:t>
+            </w:r>
+          </w:p>
+        </w:tc>
+      </w:tr>
+      <w:tr>
+        <w:trPr>
+          <w:trHeight w:val="271"/>
+        </w:trPr>
+        <w:tc>
+          <w:tcPr>
+            <w:tcW w:w="2597" w:type="dxa"/>
+            <w:vAlign w:val="center"/>
+          </w:tcPr>
+          <w:p>
+            <w:pPr>
+              <w:jc w:val="center"/>
+            </w:pPr>
+            <w:r>
+              <w:t>Age</w:t>
+            </w:r>
+          </w:p>
+        </w:tc>
+        <w:tc>
+          <w:tcPr>
+            <w:tcW w:w="2955" w:type="dxa"/>
+            <w:vAlign w:val="center"/>
+          </w:tcPr>
+          <w:p>
+            <w:pPr>
+              <w:jc w:val="center"/>
+            </w:pPr>
+            <w:r>
+              <w:t>INTEGER</w:t>
+            </w:r>
+          </w:p>
+        </w:tc>
+        <w:tc>
+          <w:tcPr>
+            <w:tcW w:w="2599" w:type="dxa"/>
+            <w:vAlign w:val="center"/>
+          </w:tcPr>
+          <w:p>
+            <w:pPr>
+              <w:jc w:val="center"/>
+            </w:pPr>
+            <w:r>
+              <w:t>Derived</w:t>
+            </w:r>
+          </w:p>
+        </w:tc>
+      </w:tr>
+      <w:tr>
+        <w:trPr>
+          <w:trHeight w:val="271"/>
+        </w:trPr>
+        <w:tc>
+          <w:tcPr>
+            <w:tcW w:w="2597" w:type="dxa"/>
+            <w:vAlign w:val="center"/>
+          </w:tcPr>
+          <w:p>
+            <w:pPr>
+              <w:jc w:val="center"/>
+            </w:pPr>
+            <w:proofErr w:type="spellStart"/>
+            <w:r>
+              <w:t>AdminID</w:t>
+            </w:r>
+            <w:proofErr w:type="spellEnd"/>
+          </w:p>
+        </w:tc>
+        <w:tc>
+          <w:tcPr>
+            <w:tcW w:w="2955" w:type="dxa"/>
+            <w:vAlign w:val="center"/>
+          </w:tcPr>
+          <w:p>
+            <w:pPr>
+              <w:jc w:val="center"/>
+            </w:pPr>
+            <w:proofErr w:type="gramStart"/>
+            <w:r>
+              <w:t>VARCHAR(</w:t>
+            </w:r>
+            <w:proofErr w:type="gramEnd"/>
+            <w:r>
+              <w:t>1</w:t>
+            </w:r>
+            <w:r>
+              <w:t>0)</w:t>
+            </w:r>
+          </w:p>
+        </w:tc>
+        <w:tc>
+          <w:tcPr>
+            <w:tcW w:w="2599" w:type="dxa"/>
+            <w:vAlign w:val="center"/>
+          </w:tcPr>
+          <w:p>
+            <w:pPr>
+              <w:jc w:val="center"/>
+            </w:pPr>
+            <w:r>
+              <w:t>—</w:t>
+            </w:r>
+          </w:p>
+        </w:tc>
+      </w:tr>
+      <w:tr>
+        <w:trPr>
+          <w:trHeight w:val="283"/>
+        </w:trPr>
+        <w:tc>
+          <w:tcPr>
+            <w:tcW w:w="2597" w:type="dxa"/>
+            <w:vAlign w:val="center"/>
+          </w:tcPr>
+          <w:p>
+            <w:pPr>
+              <w:jc w:val="center"/>
+            </w:pPr>
+            <w:r>
+              <w:t>Email</w:t>
+            </w:r>
+          </w:p>
+        </w:tc>
+        <w:tc>
+          <w:tcPr>
+            <w:tcW w:w="2955" w:type="dxa"/>
+            <w:vAlign w:val="center"/>
+          </w:tcPr>
+          <w:p>
+            <w:pPr>
+              <w:jc w:val="center"/>
+            </w:pPr>
+            <w:proofErr w:type="gramStart"/>
+            <w:r>
+              <w:t>VARCHAR(</w:t>
+            </w:r>
+            <w:proofErr w:type="gramEnd"/>
+            <w:r>
+              <w:t>100)</w:t>
+            </w:r>
+          </w:p>
+        </w:tc>
+        <w:tc>
+          <w:tcPr>
+            <w:tcW w:w="2599" w:type="dxa"/>
+            <w:vAlign w:val="center"/>
+          </w:tcPr>
+          <w:p>
+            <w:pPr>
+              <w:jc w:val="center"/>
+            </w:pPr>
+            <w:r>
+              <w:t>—</w:t>
+            </w:r>
+          </w:p>
+        </w:tc>
+      </w:tr>
+      <w:tr>
+        <w:trPr>
+          <w:trHeight w:val="283"/>
+        </w:trPr>
+        <w:tc>
+          <w:tcPr>
+            <w:tcW w:w="2597" w:type="dxa"/>
+            <w:vAlign w:val="center"/>
+          </w:tcPr>
+          <w:p>
+            <w:pPr>
+              <w:jc w:val="center"/>
+            </w:pPr>
+            <w:r>
+              <w:t>Phone</w:t>
+            </w:r>
+          </w:p>
+        </w:tc>
+        <w:tc>
+          <w:tcPr>
+            <w:tcW w:w="2955" w:type="dxa"/>
+            <w:vAlign w:val="center"/>
+          </w:tcPr>
+          <w:p>
+            <w:pPr>
+              <w:jc w:val="center"/>
+            </w:pPr>
+            <w:proofErr w:type="gramStart"/>
+            <w:r>
+              <w:t>VARCHAR(</w:t>
+            </w:r>
+            <w:proofErr w:type="gramEnd"/>
+            <w:r>
+              <w:t>15)</w:t>
+            </w:r>
+          </w:p>
+        </w:tc>
+        <w:tc>
+          <w:tcPr>
+            <w:tcW w:w="2599" w:type="dxa"/>
+            <w:vAlign w:val="center"/>
+          </w:tcPr>
+          <w:p>
+            <w:pPr>
+              <w:jc w:val="center"/>
+            </w:pPr>
+            <w:r>
+              <w:t>—</w:t>
+            </w:r>
+          </w:p>
+        </w:tc>
+      </w:tr>
+      <w:tr>
+        <w:trPr>
+          <w:trHeight w:val="283"/>
+        </w:trPr>
+        <w:tc>
+          <w:tcPr>
+            <w:tcW w:w="2597" w:type="dxa"/>
+            <w:vAlign w:val="center"/>
+          </w:tcPr>
+          <w:p>
+            <w:pPr>
+              <w:jc w:val="center"/>
+            </w:pPr>
+            <w:proofErr w:type="spellStart"/>
+            <w:r>
+              <w:t>HouseNo</w:t>
+            </w:r>
+            <w:proofErr w:type="spellEnd"/>
+          </w:p>
+        </w:tc>
+        <w:tc>
+          <w:tcPr>
+            <w:tcW w:w="2955" w:type="dxa"/>
+            <w:vAlign w:val="center"/>
+          </w:tcPr>
+          <w:p>
+            <w:pPr>
+              <w:jc w:val="center"/>
+            </w:pPr>
+            <w:proofErr w:type="gramStart"/>
+            <w:r>
+              <w:t>VARCHAR(</w:t>
+            </w:r>
+            <w:proofErr w:type="gramEnd"/>
+            <w:r>
+              <w:t>20)</w:t>
+            </w:r>
+          </w:p>
+        </w:tc>
+        <w:tc>
+          <w:tcPr>
+            <w:tcW w:w="2599" w:type="dxa"/>
+            <w:vAlign w:val="center"/>
+          </w:tcPr>
+          <w:p>
+            <w:pPr>
+              <w:jc w:val="center"/>
+            </w:pPr>
+            <w:r>
+              <w:t>—</w:t>
+            </w:r>
+          </w:p>
+        </w:tc>
+      </w:tr>
+      <w:tr>
+        <w:trPr>
+          <w:trHeight w:val="283"/>
+        </w:trPr>
+        <w:tc>
+          <w:tcPr>
+            <w:tcW w:w="2597" w:type="dxa"/>
+            <w:vAlign w:val="center"/>
+          </w:tcPr>
+          <w:p>
+            <w:pPr>
+              <w:jc w:val="center"/>
+            </w:pPr>
+            <w:r>
+              <w:t>City</w:t>
+            </w:r>
+          </w:p>
+        </w:tc>
+        <w:tc>
+          <w:tcPr>
+            <w:tcW w:w="2955" w:type="dxa"/>
+            <w:vAlign w:val="center"/>
+          </w:tcPr>
+          <w:p>
+            <w:pPr>
+              <w:jc w:val="center"/>
+            </w:pPr>
+            <w:proofErr w:type="gramStart"/>
+            <w:r>
+              <w:t>VARCHAR(</w:t>
+            </w:r>
+            <w:proofErr w:type="gramEnd"/>
+            <w:r>
+              <w:t>5</w:t>
+            </w:r>
+            <w:r>
+              <w:t>0)</w:t>
+            </w:r>
+          </w:p>
+        </w:tc>
+        <w:tc>
+          <w:tcPr>
+            <w:tcW w:w="2599" w:type="dxa"/>
+            <w:vAlign w:val="center"/>
+          </w:tcPr>
+          <w:p>
+            <w:pPr>
+              <w:jc w:val="center"/>
+            </w:pPr>
+            <w:r>
+              <w:t>—</w:t>
+            </w:r>
+          </w:p>
+        </w:tc>
+      </w:tr>
+      <w:tr>
+        <w:trPr>
+          <w:trHeight w:val="283"/>
+        </w:trPr>
+        <w:tc>
+          <w:tcPr>
+            <w:tcW w:w="2597" w:type="dxa"/>
+          </w:tcPr>
+          <w:p>
+            <w:pPr>
+              <w:jc w:val="center"/>
+            </w:pPr>
+            <w:r>
+              <w:t>Pin</w:t>
+            </w:r>
+          </w:p>
+        </w:tc>
+        <w:tc>
+          <w:tcPr>
+            <w:tcW w:w="2955" w:type="dxa"/>
+          </w:tcPr>
+          <w:p>
+            <w:pPr>
+              <w:jc w:val="center"/>
+            </w:pPr>
+            <w:proofErr w:type="gramStart"/>
+            <w:r>
+              <w:t>VARCHAR(</w:t>
+            </w:r>
+            <w:proofErr w:type="gramEnd"/>
+            <w:r>
+              <w:t>1</w:t>
+            </w:r>
+            <w:r>
+              <w:t>0)</w:t>
+            </w:r>
+          </w:p>
+        </w:tc>
+        <w:tc>
+          <w:tcPr>
+            <w:tcW w:w="2599" w:type="dxa"/>
+          </w:tcPr>
+          <w:p>
+            <w:pPr>
+              <w:jc w:val="center"/>
+            </w:pPr>
+            <w:r>
+              <w:t>—</w:t>
             </w:r>
           </w:p>
         </w:tc>
@@ -4479,7 +5443,6 @@
           <w:sz w:val="26"/>
           <w:szCs w:val="26"/>
         </w:rPr>
-        <w:lastRenderedPageBreak/>
         <w:t>RegNo</w:t>
       </w:r>
       <w:proofErr w:type="spellEnd"/>
@@ -4769,7 +5732,25 @@
           <w:sz w:val="26"/>
           <w:szCs w:val="26"/>
         </w:rPr>
-        <w:t>, Date, Status</w:t>
+        <w:t xml:space="preserve">, </w:t>
+      </w:r>
+      <w:proofErr w:type="spellStart"/>
+      <w:r>
+        <w:rPr>
+          <w:rFonts w:ascii="Times New Roman" w:hAnsi="Times New Roman" w:cs="Times New Roman"/>
+          <w:sz w:val="26"/>
+          <w:szCs w:val="26"/>
+        </w:rPr>
+        <w:t>AttendanceDate</w:t>
+      </w:r>
+      <w:proofErr w:type="spellEnd"/>
+      <w:r>
+        <w:rPr>
+          <w:rFonts w:ascii="Times New Roman" w:hAnsi="Times New Roman" w:cs="Times New Roman"/>
+          <w:sz w:val="26"/>
+          <w:szCs w:val="26"/>
+        </w:rPr>
+        <w:t>, Status</w:t>
       </w:r>
       <w:r>
         <w:rPr>
@@ -4868,42 +5849,6 @@
           <w:sz w:val="26"/>
           <w:szCs w:val="26"/>
         </w:rPr>
-        <w:t xml:space="preserve">, </w:t>
-      </w:r>
-      <w:proofErr w:type="spellStart"/>
-      <w:r>
-        <w:rPr>
-          <w:rFonts w:ascii="Times New Roman" w:hAnsi="Times New Roman" w:cs="Times New Roman"/>
-          <w:sz w:val="26"/>
-          <w:szCs w:val="26"/>
-        </w:rPr>
-        <w:t>TotalMarks</w:t>
-      </w:r>
-      <w:proofErr w:type="spellEnd"/>
-      <w:r>
-        <w:rPr>
-          <w:rFonts w:ascii="Times New Roman" w:hAnsi="Times New Roman" w:cs="Times New Roman"/>
-          <w:sz w:val="26"/>
-          <w:szCs w:val="26"/>
-        </w:rPr>
-        <w:t xml:space="preserve">, Average, </w:t>
-      </w:r>
-      <w:proofErr w:type="gramStart"/>
-      <w:r>
-        <w:rPr>
-          <w:rFonts w:ascii="Times New Roman" w:hAnsi="Times New Roman" w:cs="Times New Roman"/>
-          <w:sz w:val="26"/>
-          <w:szCs w:val="26"/>
-        </w:rPr>
-        <w:t>Grade</w:t>
-      </w:r>
-      <w:proofErr w:type="gramEnd"/>
-      <w:r>
-        <w:rPr>
-          <w:rFonts w:ascii="Times New Roman" w:hAnsi="Times New Roman" w:cs="Times New Roman"/>
-          <w:sz w:val="26"/>
-          <w:szCs w:val="26"/>
-        </w:rPr>
         <w:br/>
         <w:t xml:space="preserve">Each </w:t>
       </w:r>
@@ -4963,12 +5908,33 @@
           <w:szCs w:val="26"/>
         </w:rPr>
       </w:pPr>
-      <w:r>
-        <w:rPr>
-          <w:rFonts w:ascii="Times New Roman" w:hAnsi="Times New Roman" w:cs="Times New Roman"/>
-          <w:sz w:val="26"/>
-          <w:szCs w:val="26"/>
-        </w:rPr>
+    </w:p>
+    <w:p>
+      <w:pPr>
+        <w:ind w:left="720"/>
+        <w:rPr>
+          <w:rFonts w:ascii="Times New Roman" w:hAnsi="Times New Roman" w:cs="Times New Roman"/>
+          <w:sz w:val="26"/>
+          <w:szCs w:val="26"/>
+        </w:rPr>
+      </w:pPr>
+    </w:p>
+    <w:p>
+      <w:pPr>
+        <w:ind w:left="720"/>
+        <w:rPr>
+          <w:rFonts w:ascii="Times New Roman" w:hAnsi="Times New Roman" w:cs="Times New Roman"/>
+          <w:sz w:val="26"/>
+          <w:szCs w:val="26"/>
+        </w:rPr>
+      </w:pPr>
+      <w:r>
+        <w:rPr>
+          <w:rFonts w:ascii="Times New Roman" w:hAnsi="Times New Roman" w:cs="Times New Roman"/>
+          <w:sz w:val="26"/>
+          <w:szCs w:val="26"/>
+        </w:rPr>
+        <w:lastRenderedPageBreak/>
         <w:t>Candidate Key Selection Using Attribute Closure</w:t>
       </w:r>
     </w:p>
@@ -5015,7 +5981,23 @@
           <w:sz w:val="26"/>
           <w:szCs w:val="26"/>
         </w:rPr>
-        <w:t>⁺ = {</w:t>
+        <w:t xml:space="preserve"> </w:t>
+      </w:r>
+      <w:r>
+        <w:rPr>
+          <w:rFonts w:ascii="Times New Roman" w:hAnsi="Times New Roman" w:cs="Times New Roman"/>
+          <w:sz w:val="26"/>
+          <w:szCs w:val="26"/>
+        </w:rPr>
+        <w:t xml:space="preserve">→ </w:t>
+      </w:r>
+      <w:r>
+        <w:rPr>
+          <w:rFonts w:ascii="Times New Roman" w:hAnsi="Times New Roman" w:cs="Times New Roman"/>
+          <w:sz w:val="26"/>
+          <w:szCs w:val="26"/>
+        </w:rPr>
+        <w:t>{</w:t>
       </w:r>
       <w:proofErr w:type="spellStart"/>
       <w:r>
@@ -5069,7 +6051,7 @@
           <w:sz w:val="26"/>
           <w:szCs w:val="26"/>
         </w:rPr>
-        <w:t xml:space="preserve">, Age, Gender, Phone, </w:t>
+        <w:t xml:space="preserve">, Gender, Phone, </w:t>
       </w:r>
       <w:proofErr w:type="spellStart"/>
       <w:r>
@@ -5213,7 +6195,7 @@
           <w:sz w:val="26"/>
           <w:szCs w:val="26"/>
         </w:rPr>
-        <w:t xml:space="preserve">⁺ gives all administrator details, so </w:t>
+        <w:t xml:space="preserve"> gives all administrator details, so </w:t>
       </w:r>
       <w:proofErr w:type="spellStart"/>
       <w:r>
@@ -5267,7 +6249,7 @@
           <w:sz w:val="26"/>
           <w:szCs w:val="26"/>
         </w:rPr>
-        <w:t xml:space="preserve">⁺ gives all attributes of a marks record, so </w:t>
+        <w:t xml:space="preserve"> gives all attributes of a marks record, so </w:t>
       </w:r>
       <w:proofErr w:type="spellStart"/>
       <w:r>
@@ -5321,7 +6303,7 @@
           <w:sz w:val="26"/>
           <w:szCs w:val="26"/>
         </w:rPr>
-        <w:t xml:space="preserve">⁺ gives all attributes of an attendance record, so </w:t>
+        <w:t xml:space="preserve"> gives all attributes of an attendance record, so </w:t>
       </w:r>
       <w:proofErr w:type="spellStart"/>
       <w:r>
@@ -5375,7 +6357,7 @@
           <w:sz w:val="26"/>
           <w:szCs w:val="26"/>
         </w:rPr>
-        <w:t xml:space="preserve">⁺ gives all attributes of a report, so </w:t>
+        <w:t xml:space="preserve"> gives all attributes of a report, so </w:t>
       </w:r>
       <w:proofErr w:type="spellStart"/>
       <w:r>
@@ -5457,8 +6439,298 @@
           <w:sz w:val="26"/>
           <w:szCs w:val="26"/>
         </w:rPr>
+        <w:t>A table is in 1NF when every attribute contains a single value and there are no repeating groups.</w:t>
+      </w:r>
+    </w:p>
+    <w:p>
+      <w:pPr>
+        <w:ind w:left="720"/>
+        <w:rPr>
+          <w:rFonts w:ascii="Times New Roman" w:hAnsi="Times New Roman" w:cs="Times New Roman"/>
+          <w:sz w:val="26"/>
+          <w:szCs w:val="26"/>
+        </w:rPr>
+      </w:pPr>
+      <w:r>
+        <w:rPr>
+          <w:rFonts w:ascii="Times New Roman" w:hAnsi="Times New Roman" w:cs="Times New Roman"/>
+          <w:sz w:val="26"/>
+          <w:szCs w:val="26"/>
+        </w:rPr>
+        <w:t xml:space="preserve">Our tables follow 1NF because each field contains one value. For example, in the STUDENT table, </w:t>
+      </w:r>
+      <w:proofErr w:type="spellStart"/>
+      <w:r>
+        <w:rPr>
+          <w:rFonts w:ascii="Times New Roman" w:hAnsi="Times New Roman" w:cs="Times New Roman"/>
+          <w:sz w:val="26"/>
+          <w:szCs w:val="26"/>
+        </w:rPr>
+        <w:t>FullName</w:t>
+      </w:r>
+      <w:proofErr w:type="spellEnd"/>
+      <w:r>
+        <w:rPr>
+          <w:rFonts w:ascii="Times New Roman" w:hAnsi="Times New Roman" w:cs="Times New Roman"/>
+          <w:sz w:val="26"/>
+          <w:szCs w:val="26"/>
+        </w:rPr>
+        <w:t>, Phone, Gender, and Email contain individual values.</w:t>
+      </w:r>
+    </w:p>
+    <w:p>
+      <w:pPr>
+        <w:ind w:left="720"/>
+        <w:rPr>
+          <w:rFonts w:ascii="Times New Roman" w:hAnsi="Times New Roman" w:cs="Times New Roman"/>
+          <w:sz w:val="26"/>
+          <w:szCs w:val="26"/>
+        </w:rPr>
+      </w:pPr>
+      <w:r>
+        <w:rPr>
+          <w:rFonts w:ascii="Times New Roman" w:hAnsi="Times New Roman" w:cs="Times New Roman"/>
+          <w:sz w:val="26"/>
+          <w:szCs w:val="26"/>
+        </w:rPr>
+        <w:t xml:space="preserve">The Address attribute is divided into </w:t>
+      </w:r>
+      <w:proofErr w:type="spellStart"/>
+      <w:r>
+        <w:rPr>
+          <w:rFonts w:ascii="Times New Roman" w:hAnsi="Times New Roman" w:cs="Times New Roman"/>
+          <w:sz w:val="26"/>
+          <w:szCs w:val="26"/>
+        </w:rPr>
+        <w:t>HouseNo</w:t>
+      </w:r>
+      <w:proofErr w:type="spellEnd"/>
+      <w:r>
+        <w:rPr>
+          <w:rFonts w:ascii="Times New Roman" w:hAnsi="Times New Roman" w:cs="Times New Roman"/>
+          <w:sz w:val="26"/>
+          <w:szCs w:val="26"/>
+        </w:rPr>
+        <w:t>, City, and Pin, so the individual components can be stored separately.</w:t>
+      </w:r>
+    </w:p>
+    <w:p>
+      <w:pPr>
+        <w:ind w:left="720"/>
+        <w:rPr>
+          <w:rFonts w:ascii="Times New Roman" w:hAnsi="Times New Roman" w:cs="Times New Roman"/>
+          <w:sz w:val="26"/>
+          <w:szCs w:val="26"/>
+        </w:rPr>
+      </w:pPr>
+    </w:p>
+    <w:p>
+      <w:pPr>
+        <w:ind w:left="720"/>
+        <w:rPr>
+          <w:rFonts w:ascii="Times New Roman" w:hAnsi="Times New Roman" w:cs="Times New Roman"/>
+          <w:sz w:val="26"/>
+          <w:szCs w:val="26"/>
+        </w:rPr>
+      </w:pPr>
+      <w:r>
+        <w:rPr>
+          <w:rFonts w:ascii="Times New Roman" w:hAnsi="Times New Roman" w:cs="Times New Roman"/>
+          <w:sz w:val="26"/>
+          <w:szCs w:val="26"/>
+        </w:rPr>
+        <w:t>2NF (Second Normal Form):</w:t>
+      </w:r>
+    </w:p>
+    <w:p>
+      <w:pPr>
+        <w:ind w:left="720"/>
+        <w:rPr>
+          <w:rFonts w:ascii="Times New Roman" w:hAnsi="Times New Roman" w:cs="Times New Roman"/>
+          <w:sz w:val="26"/>
+          <w:szCs w:val="26"/>
+        </w:rPr>
+      </w:pPr>
+      <w:r>
+        <w:rPr>
+          <w:rFonts w:ascii="Times New Roman" w:hAnsi="Times New Roman" w:cs="Times New Roman"/>
+          <w:sz w:val="26"/>
+          <w:szCs w:val="26"/>
+        </w:rPr>
+        <w:t>A table is in 2NF when it is already in 1NF and there is no partial dependency, meaning non-key attributes should depend on the complete primary key.</w:t>
+      </w:r>
+    </w:p>
+    <w:p>
+      <w:pPr>
+        <w:ind w:left="720"/>
+        <w:rPr>
+          <w:rFonts w:ascii="Times New Roman" w:hAnsi="Times New Roman" w:cs="Times New Roman"/>
+          <w:sz w:val="26"/>
+          <w:szCs w:val="26"/>
+        </w:rPr>
+      </w:pPr>
+      <w:r>
+        <w:rPr>
+          <w:rFonts w:ascii="Times New Roman" w:hAnsi="Times New Roman" w:cs="Times New Roman"/>
+          <w:sz w:val="26"/>
+          <w:szCs w:val="26"/>
+        </w:rPr>
+        <w:t xml:space="preserve">In our system, the main tables use single-attribute primary keys such as </w:t>
+      </w:r>
+      <w:proofErr w:type="spellStart"/>
+      <w:r>
+        <w:rPr>
+          <w:rFonts w:ascii="Times New Roman" w:hAnsi="Times New Roman" w:cs="Times New Roman"/>
+          <w:sz w:val="26"/>
+          <w:szCs w:val="26"/>
+        </w:rPr>
+        <w:t>RegNo</w:t>
+      </w:r>
+      <w:proofErr w:type="spellEnd"/>
+      <w:r>
+        <w:rPr>
+          <w:rFonts w:ascii="Times New Roman" w:hAnsi="Times New Roman" w:cs="Times New Roman"/>
+          <w:sz w:val="26"/>
+          <w:szCs w:val="26"/>
+        </w:rPr>
+        <w:t xml:space="preserve">, </w:t>
+      </w:r>
+      <w:proofErr w:type="spellStart"/>
+      <w:r>
+        <w:rPr>
+          <w:rFonts w:ascii="Times New Roman" w:hAnsi="Times New Roman" w:cs="Times New Roman"/>
+          <w:sz w:val="26"/>
+          <w:szCs w:val="26"/>
+        </w:rPr>
+        <w:t>MarkID</w:t>
+      </w:r>
+      <w:proofErr w:type="spellEnd"/>
+      <w:r>
+        <w:rPr>
+          <w:rFonts w:ascii="Times New Roman" w:hAnsi="Times New Roman" w:cs="Times New Roman"/>
+          <w:sz w:val="26"/>
+          <w:szCs w:val="26"/>
+        </w:rPr>
+        <w:t xml:space="preserve">, </w:t>
+      </w:r>
+      <w:proofErr w:type="spellStart"/>
+      <w:r>
+        <w:rPr>
+          <w:rFonts w:ascii="Times New Roman" w:hAnsi="Times New Roman" w:cs="Times New Roman"/>
+          <w:sz w:val="26"/>
+          <w:szCs w:val="26"/>
+        </w:rPr>
+        <w:t>AttendID</w:t>
+      </w:r>
+      <w:proofErr w:type="spellEnd"/>
+      <w:r>
+        <w:rPr>
+          <w:rFonts w:ascii="Times New Roman" w:hAnsi="Times New Roman" w:cs="Times New Roman"/>
+          <w:sz w:val="26"/>
+          <w:szCs w:val="26"/>
+        </w:rPr>
+        <w:t xml:space="preserve">, and </w:t>
+      </w:r>
+      <w:proofErr w:type="spellStart"/>
+      <w:r>
+        <w:rPr>
+          <w:rFonts w:ascii="Times New Roman" w:hAnsi="Times New Roman" w:cs="Times New Roman"/>
+          <w:sz w:val="26"/>
+          <w:szCs w:val="26"/>
+        </w:rPr>
+        <w:t>ReportID</w:t>
+      </w:r>
+      <w:proofErr w:type="spellEnd"/>
+      <w:r>
+        <w:rPr>
+          <w:rFonts w:ascii="Times New Roman" w:hAnsi="Times New Roman" w:cs="Times New Roman"/>
+          <w:sz w:val="26"/>
+          <w:szCs w:val="26"/>
+        </w:rPr>
+        <w:t>. Therefore, partial dependency does not occur because there is no composite primary key.</w:t>
+      </w:r>
+    </w:p>
+    <w:p>
+      <w:pPr>
+        <w:ind w:left="720"/>
+        <w:rPr>
+          <w:rFonts w:ascii="Times New Roman" w:hAnsi="Times New Roman" w:cs="Times New Roman"/>
+          <w:sz w:val="26"/>
+          <w:szCs w:val="26"/>
+        </w:rPr>
+      </w:pPr>
+      <w:r>
+        <w:rPr>
+          <w:rFonts w:ascii="Times New Roman" w:hAnsi="Times New Roman" w:cs="Times New Roman"/>
+          <w:sz w:val="26"/>
+          <w:szCs w:val="26"/>
+        </w:rPr>
+        <w:t>For example, in STUDENT:</w:t>
+      </w:r>
+    </w:p>
+    <w:p>
+      <w:pPr>
+        <w:ind w:left="720"/>
+        <w:rPr>
+          <w:rFonts w:ascii="Times New Roman" w:hAnsi="Times New Roman" w:cs="Times New Roman"/>
+          <w:sz w:val="26"/>
+          <w:szCs w:val="26"/>
+        </w:rPr>
+      </w:pPr>
+      <w:proofErr w:type="spellStart"/>
+      <w:r>
+        <w:rPr>
+          <w:rFonts w:ascii="Times New Roman" w:hAnsi="Times New Roman" w:cs="Times New Roman"/>
+          <w:sz w:val="26"/>
+          <w:szCs w:val="26"/>
+        </w:rPr>
         <w:lastRenderedPageBreak/>
-        <w:t>A table is in 1NF when every attribute contains a single value and there are no repeating groups.</w:t>
+        <w:t>RegNo</w:t>
+      </w:r>
+      <w:proofErr w:type="spellEnd"/>
+      <w:r>
+        <w:rPr>
+          <w:rFonts w:ascii="Times New Roman" w:hAnsi="Times New Roman" w:cs="Times New Roman"/>
+          <w:sz w:val="26"/>
+          <w:szCs w:val="26"/>
+        </w:rPr>
+        <w:t xml:space="preserve"> → </w:t>
+      </w:r>
+      <w:proofErr w:type="spellStart"/>
+      <w:r>
+        <w:rPr>
+          <w:rFonts w:ascii="Times New Roman" w:hAnsi="Times New Roman" w:cs="Times New Roman"/>
+          <w:sz w:val="26"/>
+          <w:szCs w:val="26"/>
+        </w:rPr>
+        <w:t>FullName</w:t>
+      </w:r>
+      <w:proofErr w:type="spellEnd"/>
+      <w:r>
+        <w:rPr>
+          <w:rFonts w:ascii="Times New Roman" w:hAnsi="Times New Roman" w:cs="Times New Roman"/>
+          <w:sz w:val="26"/>
+          <w:szCs w:val="26"/>
+        </w:rPr>
+        <w:t xml:space="preserve">, Class, </w:t>
+      </w:r>
+      <w:proofErr w:type="spellStart"/>
+      <w:r>
+        <w:rPr>
+          <w:rFonts w:ascii="Times New Roman" w:hAnsi="Times New Roman" w:cs="Times New Roman"/>
+          <w:sz w:val="26"/>
+          <w:szCs w:val="26"/>
+        </w:rPr>
+        <w:t>DateOfBirth</w:t>
+      </w:r>
+      <w:proofErr w:type="spellEnd"/>
+      <w:r>
+        <w:rPr>
+          <w:rFonts w:ascii="Times New Roman" w:hAnsi="Times New Roman" w:cs="Times New Roman"/>
+          <w:sz w:val="26"/>
+          <w:szCs w:val="26"/>
+        </w:rPr>
+        <w:t>, Gender, Phone, Email</w:t>
       </w:r>
     </w:p>
     <w:p>
@@ -5476,7 +6748,7 @@
           <w:sz w:val="26"/>
           <w:szCs w:val="26"/>
         </w:rPr>
-        <w:t xml:space="preserve">Our tables follow 1NF because each field contains one value. For example, in the STUDENT table, </w:t>
+        <w:t xml:space="preserve">All these attributes depend completely on </w:t>
       </w:r>
       <w:proofErr w:type="spellStart"/>
       <w:r>
@@ -5485,7 +6757,7 @@
           <w:sz w:val="26"/>
           <w:szCs w:val="26"/>
         </w:rPr>
-        <w:t>FullName</w:t>
+        <w:t>RegNo</w:t>
       </w:r>
       <w:proofErr w:type="spellEnd"/>
       <w:r>
@@ -5494,7 +6766,7 @@
           <w:sz w:val="26"/>
           <w:szCs w:val="26"/>
         </w:rPr>
-        <w:t>, Phone, Gender, and Email contain individual values.</w:t>
+        <w:t>.</w:t>
       </w:r>
     </w:p>
     <w:p>
@@ -5506,13 +6778,95 @@
           <w:szCs w:val="26"/>
         </w:rPr>
       </w:pPr>
-      <w:r>
-        <w:rPr>
-          <w:rFonts w:ascii="Times New Roman" w:hAnsi="Times New Roman" w:cs="Times New Roman"/>
-          <w:sz w:val="26"/>
-          <w:szCs w:val="26"/>
-        </w:rPr>
-        <w:t xml:space="preserve">The Address attribute is divided into </w:t>
+    </w:p>
+    <w:p>
+      <w:pPr>
+        <w:ind w:left="720"/>
+        <w:rPr>
+          <w:rFonts w:ascii="Times New Roman" w:hAnsi="Times New Roman" w:cs="Times New Roman"/>
+          <w:sz w:val="26"/>
+          <w:szCs w:val="26"/>
+        </w:rPr>
+      </w:pPr>
+      <w:r>
+        <w:rPr>
+          <w:rFonts w:ascii="Times New Roman" w:hAnsi="Times New Roman" w:cs="Times New Roman"/>
+          <w:sz w:val="26"/>
+          <w:szCs w:val="26"/>
+        </w:rPr>
+        <w:t>3NF (Third Normal Form):</w:t>
+      </w:r>
+    </w:p>
+    <w:p>
+      <w:pPr>
+        <w:ind w:left="720"/>
+        <w:rPr>
+          <w:rFonts w:ascii="Times New Roman" w:hAnsi="Times New Roman" w:cs="Times New Roman"/>
+          <w:sz w:val="26"/>
+          <w:szCs w:val="26"/>
+        </w:rPr>
+      </w:pPr>
+      <w:r>
+        <w:rPr>
+          <w:rFonts w:ascii="Times New Roman" w:hAnsi="Times New Roman" w:cs="Times New Roman"/>
+          <w:sz w:val="26"/>
+          <w:szCs w:val="26"/>
+        </w:rPr>
+        <w:t>A table is in 3NF when it is in 2NF and there is no transitive dependency, where a non-key attribute depends on another non-key attribute.</w:t>
+      </w:r>
+    </w:p>
+    <w:p>
+      <w:pPr>
+        <w:ind w:left="720"/>
+        <w:rPr>
+          <w:rFonts w:ascii="Times New Roman" w:hAnsi="Times New Roman" w:cs="Times New Roman"/>
+          <w:sz w:val="26"/>
+          <w:szCs w:val="26"/>
+        </w:rPr>
+      </w:pPr>
+      <w:r>
+        <w:rPr>
+          <w:rFonts w:ascii="Times New Roman" w:hAnsi="Times New Roman" w:cs="Times New Roman"/>
+          <w:sz w:val="26"/>
+          <w:szCs w:val="26"/>
+        </w:rPr>
+        <w:t>To avoid unnecessary dependencies, administrator details are stored separately in the ADMINISTRATOR table, while student details are stored in the STUDENT table.</w:t>
+      </w:r>
+    </w:p>
+    <w:p>
+      <w:pPr>
+        <w:ind w:left="720"/>
+        <w:rPr>
+          <w:rFonts w:ascii="Times New Roman" w:hAnsi="Times New Roman" w:cs="Times New Roman"/>
+          <w:sz w:val="26"/>
+          <w:szCs w:val="26"/>
+        </w:rPr>
+      </w:pPr>
+      <w:r>
+        <w:rPr>
+          <w:rFonts w:ascii="Times New Roman" w:hAnsi="Times New Roman" w:cs="Times New Roman"/>
+          <w:sz w:val="26"/>
+          <w:szCs w:val="26"/>
+        </w:rPr>
+        <w:t>For example:</w:t>
+      </w:r>
+    </w:p>
+    <w:p>
+      <w:pPr>
+        <w:ind w:left="720"/>
+        <w:rPr>
+          <w:rFonts w:ascii="Times New Roman" w:hAnsi="Times New Roman" w:cs="Times New Roman"/>
+          <w:sz w:val="26"/>
+          <w:szCs w:val="26"/>
+        </w:rPr>
+      </w:pPr>
+      <w:r>
+        <w:rPr>
+          <w:rFonts w:ascii="Times New Roman" w:hAnsi="Times New Roman" w:cs="Times New Roman"/>
+          <w:sz w:val="26"/>
+          <w:szCs w:val="26"/>
+        </w:rPr>
+        <w:t xml:space="preserve">Student </w:t>
       </w:r>
       <w:proofErr w:type="spellStart"/>
       <w:r>
@@ -5521,7 +6875,7 @@
           <w:sz w:val="26"/>
           <w:szCs w:val="26"/>
         </w:rPr>
-        <w:t>HouseNo</w:t>
+        <w:t>RegNo</w:t>
       </w:r>
       <w:proofErr w:type="spellEnd"/>
       <w:r>
@@ -5530,7 +6884,25 @@
           <w:sz w:val="26"/>
           <w:szCs w:val="26"/>
         </w:rPr>
-        <w:t>, City, and Pin, so the individual components can be stored separately.</w:t>
+        <w:t xml:space="preserve"> → </w:t>
+      </w:r>
+      <w:proofErr w:type="spellStart"/>
+      <w:r>
+        <w:rPr>
+          <w:rFonts w:ascii="Times New Roman" w:hAnsi="Times New Roman" w:cs="Times New Roman"/>
+          <w:sz w:val="26"/>
+          <w:szCs w:val="26"/>
+        </w:rPr>
+        <w:t>AdminID</w:t>
+      </w:r>
+      <w:proofErr w:type="spellEnd"/>
+      <w:r>
+        <w:rPr>
+          <w:rFonts w:ascii="Times New Roman" w:hAnsi="Times New Roman" w:cs="Times New Roman"/>
+          <w:sz w:val="26"/>
+          <w:szCs w:val="26"/>
+        </w:rPr>
+        <w:t xml:space="preserve"> → Administrator details</w:t>
       </w:r>
     </w:p>
     <w:p>
@@ -5542,6 +6914,32 @@
           <w:szCs w:val="26"/>
         </w:rPr>
       </w:pPr>
+      <w:r>
+        <w:rPr>
+          <w:rFonts w:ascii="Times New Roman" w:hAnsi="Times New Roman" w:cs="Times New Roman"/>
+          <w:sz w:val="26"/>
+          <w:szCs w:val="26"/>
+        </w:rPr>
+        <w:t xml:space="preserve">Instead of storing administrator username and password repeatedly for every student, we store </w:t>
+      </w:r>
+      <w:proofErr w:type="spellStart"/>
+      <w:r>
+        <w:rPr>
+          <w:rFonts w:ascii="Times New Roman" w:hAnsi="Times New Roman" w:cs="Times New Roman"/>
+          <w:sz w:val="26"/>
+          <w:szCs w:val="26"/>
+        </w:rPr>
+        <w:t>AdminID</w:t>
+      </w:r>
+      <w:proofErr w:type="spellEnd"/>
+      <w:r>
+        <w:rPr>
+          <w:rFonts w:ascii="Times New Roman" w:hAnsi="Times New Roman" w:cs="Times New Roman"/>
+          <w:sz w:val="26"/>
+          <w:szCs w:val="26"/>
+        </w:rPr>
+        <w:t xml:space="preserve"> as a foreign key in STUDENT and keep the administrator details in the ADMINISTRATOR table.</w:t>
+      </w:r>
     </w:p>
     <w:p>
       <w:pPr>
@@ -5558,7 +6956,25 @@
           <w:sz w:val="26"/>
           <w:szCs w:val="26"/>
         </w:rPr>
-        <w:t>2NF (Second Normal Form):</w:t>
+        <w:t xml:space="preserve">Similarly, marks and attendance are stored separately using </w:t>
+      </w:r>
+      <w:proofErr w:type="spellStart"/>
+      <w:r>
+        <w:rPr>
+          <w:rFonts w:ascii="Times New Roman" w:hAnsi="Times New Roman" w:cs="Times New Roman"/>
+          <w:sz w:val="26"/>
+          <w:szCs w:val="26"/>
+        </w:rPr>
+        <w:t>RegNo</w:t>
+      </w:r>
+      <w:proofErr w:type="spellEnd"/>
+      <w:r>
+        <w:rPr>
+          <w:rFonts w:ascii="Times New Roman" w:hAnsi="Times New Roman" w:cs="Times New Roman"/>
+          <w:sz w:val="26"/>
+          <w:szCs w:val="26"/>
+        </w:rPr>
+        <w:t xml:space="preserve"> as a foreign key.</w:t>
       </w:r>
     </w:p>
     <w:p>
@@ -5576,7 +6992,7 @@
           <w:sz w:val="26"/>
           <w:szCs w:val="26"/>
         </w:rPr>
-        <w:t>A table is in 2NF when it is already in 1NF and there is no partial dependency, meaning non-key attributes should depend on the complete primary key.</w:t>
+        <w:t>BCNF (Boyce-Codd Normal Form):</w:t>
       </w:r>
     </w:p>
     <w:p>
@@ -5594,7 +7010,25 @@
           <w:sz w:val="26"/>
           <w:szCs w:val="26"/>
         </w:rPr>
-        <w:t xml:space="preserve">In our system, the main tables use single-attribute primary keys such as </w:t>
+        <w:t>A relation is in BCNF when every determinant is a candidate key.</w:t>
+      </w:r>
+    </w:p>
+    <w:p>
+      <w:pPr>
+        <w:ind w:left="720"/>
+        <w:rPr>
+          <w:rFonts w:ascii="Times New Roman" w:hAnsi="Times New Roman" w:cs="Times New Roman"/>
+          <w:sz w:val="26"/>
+          <w:szCs w:val="26"/>
+        </w:rPr>
+      </w:pPr>
+      <w:r>
+        <w:rPr>
+          <w:rFonts w:ascii="Times New Roman" w:hAnsi="Times New Roman" w:cs="Times New Roman"/>
+          <w:sz w:val="26"/>
+          <w:szCs w:val="26"/>
+        </w:rPr>
+        <w:t xml:space="preserve">In our database, the main determinants such as </w:t>
       </w:r>
       <w:proofErr w:type="spellStart"/>
       <w:r>
@@ -5603,7 +7037,7 @@
           <w:sz w:val="26"/>
           <w:szCs w:val="26"/>
         </w:rPr>
-        <w:t>RegNo</w:t>
+        <w:t>AdminID</w:t>
       </w:r>
       <w:proofErr w:type="spellEnd"/>
       <w:r>
@@ -5621,7 +7055,7 @@
           <w:sz w:val="26"/>
           <w:szCs w:val="26"/>
         </w:rPr>
-        <w:t>MarkID</w:t>
+        <w:t>RegNo,</w:t>
       </w:r>
       <w:proofErr w:type="spellEnd"/>
       <w:r>
@@ -5630,460 +7064,7 @@
           <w:sz w:val="26"/>
           <w:szCs w:val="26"/>
         </w:rPr>
-        <w:t xml:space="preserve">, </w:t>
-      </w:r>
-      <w:proofErr w:type="spellStart"/>
-      <w:r>
-        <w:rPr>
-          <w:rFonts w:ascii="Times New Roman" w:hAnsi="Times New Roman" w:cs="Times New Roman"/>
-          <w:sz w:val="26"/>
-          <w:szCs w:val="26"/>
-        </w:rPr>
-        <w:t>AttendID</w:t>
-      </w:r>
-      <w:proofErr w:type="spellEnd"/>
-      <w:r>
-        <w:rPr>
-          <w:rFonts w:ascii="Times New Roman" w:hAnsi="Times New Roman" w:cs="Times New Roman"/>
-          <w:sz w:val="26"/>
-          <w:szCs w:val="26"/>
-        </w:rPr>
-        <w:t xml:space="preserve">, and </w:t>
-      </w:r>
-      <w:proofErr w:type="spellStart"/>
-      <w:r>
-        <w:rPr>
-          <w:rFonts w:ascii="Times New Roman" w:hAnsi="Times New Roman" w:cs="Times New Roman"/>
-          <w:sz w:val="26"/>
-          <w:szCs w:val="26"/>
-        </w:rPr>
-        <w:t>ReportID</w:t>
-      </w:r>
-      <w:proofErr w:type="spellEnd"/>
-      <w:r>
-        <w:rPr>
-          <w:rFonts w:ascii="Times New Roman" w:hAnsi="Times New Roman" w:cs="Times New Roman"/>
-          <w:sz w:val="26"/>
-          <w:szCs w:val="26"/>
-        </w:rPr>
-        <w:t>. Therefore, partial dependency does not occur because there is no composite primary key.</w:t>
-      </w:r>
-    </w:p>
-    <w:p>
-      <w:pPr>
-        <w:ind w:left="720"/>
-        <w:rPr>
-          <w:rFonts w:ascii="Times New Roman" w:hAnsi="Times New Roman" w:cs="Times New Roman"/>
-          <w:sz w:val="26"/>
-          <w:szCs w:val="26"/>
-        </w:rPr>
-      </w:pPr>
-      <w:r>
-        <w:rPr>
-          <w:rFonts w:ascii="Times New Roman" w:hAnsi="Times New Roman" w:cs="Times New Roman"/>
-          <w:sz w:val="26"/>
-          <w:szCs w:val="26"/>
-        </w:rPr>
-        <w:t>For example, in STUDENT:</w:t>
-      </w:r>
-    </w:p>
-    <w:p>
-      <w:pPr>
-        <w:ind w:left="720"/>
-        <w:rPr>
-          <w:rFonts w:ascii="Times New Roman" w:hAnsi="Times New Roman" w:cs="Times New Roman"/>
-          <w:sz w:val="26"/>
-          <w:szCs w:val="26"/>
-        </w:rPr>
-      </w:pPr>
-      <w:proofErr w:type="spellStart"/>
-      <w:r>
-        <w:rPr>
-          <w:rFonts w:ascii="Times New Roman" w:hAnsi="Times New Roman" w:cs="Times New Roman"/>
-          <w:sz w:val="26"/>
-          <w:szCs w:val="26"/>
-        </w:rPr>
-        <w:t>RegNo</w:t>
-      </w:r>
-      <w:proofErr w:type="spellEnd"/>
-      <w:r>
-        <w:rPr>
-          <w:rFonts w:ascii="Times New Roman" w:hAnsi="Times New Roman" w:cs="Times New Roman"/>
-          <w:sz w:val="26"/>
-          <w:szCs w:val="26"/>
-        </w:rPr>
-        <w:t xml:space="preserve"> → </w:t>
-      </w:r>
-      <w:proofErr w:type="spellStart"/>
-      <w:r>
-        <w:rPr>
-          <w:rFonts w:ascii="Times New Roman" w:hAnsi="Times New Roman" w:cs="Times New Roman"/>
-          <w:sz w:val="26"/>
-          <w:szCs w:val="26"/>
-        </w:rPr>
-        <w:t>FullName</w:t>
-      </w:r>
-      <w:proofErr w:type="spellEnd"/>
-      <w:r>
-        <w:rPr>
-          <w:rFonts w:ascii="Times New Roman" w:hAnsi="Times New Roman" w:cs="Times New Roman"/>
-          <w:sz w:val="26"/>
-          <w:szCs w:val="26"/>
-        </w:rPr>
-        <w:t xml:space="preserve">, Class, </w:t>
-      </w:r>
-      <w:proofErr w:type="spellStart"/>
-      <w:r>
-        <w:rPr>
-          <w:rFonts w:ascii="Times New Roman" w:hAnsi="Times New Roman" w:cs="Times New Roman"/>
-          <w:sz w:val="26"/>
-          <w:szCs w:val="26"/>
-        </w:rPr>
-        <w:t>DateOfBirth</w:t>
-      </w:r>
-      <w:proofErr w:type="spellEnd"/>
-      <w:r>
-        <w:rPr>
-          <w:rFonts w:ascii="Times New Roman" w:hAnsi="Times New Roman" w:cs="Times New Roman"/>
-          <w:sz w:val="26"/>
-          <w:szCs w:val="26"/>
-        </w:rPr>
-        <w:t>, Gender, Phone, Email</w:t>
-      </w:r>
-    </w:p>
-    <w:p>
-      <w:pPr>
-        <w:ind w:left="720"/>
-        <w:rPr>
-          <w:rFonts w:ascii="Times New Roman" w:hAnsi="Times New Roman" w:cs="Times New Roman"/>
-          <w:sz w:val="26"/>
-          <w:szCs w:val="26"/>
-        </w:rPr>
-      </w:pPr>
-      <w:r>
-        <w:rPr>
-          <w:rFonts w:ascii="Times New Roman" w:hAnsi="Times New Roman" w:cs="Times New Roman"/>
-          <w:sz w:val="26"/>
-          <w:szCs w:val="26"/>
-        </w:rPr>
-        <w:t xml:space="preserve">All these attributes depend completely on </w:t>
-      </w:r>
-      <w:proofErr w:type="spellStart"/>
-      <w:r>
-        <w:rPr>
-          <w:rFonts w:ascii="Times New Roman" w:hAnsi="Times New Roman" w:cs="Times New Roman"/>
-          <w:sz w:val="26"/>
-          <w:szCs w:val="26"/>
-        </w:rPr>
-        <w:t>RegNo</w:t>
-      </w:r>
-      <w:proofErr w:type="spellEnd"/>
-      <w:r>
-        <w:rPr>
-          <w:rFonts w:ascii="Times New Roman" w:hAnsi="Times New Roman" w:cs="Times New Roman"/>
-          <w:sz w:val="26"/>
-          <w:szCs w:val="26"/>
-        </w:rPr>
-        <w:t>.</w:t>
-      </w:r>
-    </w:p>
-    <w:p>
-      <w:pPr>
-        <w:ind w:left="720"/>
-        <w:rPr>
-          <w:rFonts w:ascii="Times New Roman" w:hAnsi="Times New Roman" w:cs="Times New Roman"/>
-          <w:sz w:val="26"/>
-          <w:szCs w:val="26"/>
-        </w:rPr>
-      </w:pPr>
-    </w:p>
-    <w:p>
-      <w:pPr>
-        <w:ind w:left="720"/>
-        <w:rPr>
-          <w:rFonts w:ascii="Times New Roman" w:hAnsi="Times New Roman" w:cs="Times New Roman"/>
-          <w:sz w:val="26"/>
-          <w:szCs w:val="26"/>
-        </w:rPr>
-      </w:pPr>
-      <w:r>
-        <w:rPr>
-          <w:rFonts w:ascii="Times New Roman" w:hAnsi="Times New Roman" w:cs="Times New Roman"/>
-          <w:sz w:val="26"/>
-          <w:szCs w:val="26"/>
-        </w:rPr>
-        <w:t>3NF (Third Normal Form):</w:t>
-      </w:r>
-    </w:p>
-    <w:p>
-      <w:pPr>
-        <w:ind w:left="720"/>
-        <w:rPr>
-          <w:rFonts w:ascii="Times New Roman" w:hAnsi="Times New Roman" w:cs="Times New Roman"/>
-          <w:sz w:val="26"/>
-          <w:szCs w:val="26"/>
-        </w:rPr>
-      </w:pPr>
-      <w:r>
-        <w:rPr>
-          <w:rFonts w:ascii="Times New Roman" w:hAnsi="Times New Roman" w:cs="Times New Roman"/>
-          <w:sz w:val="26"/>
-          <w:szCs w:val="26"/>
-        </w:rPr>
-        <w:t>A table is in 3NF when it is in 2NF and there is no transitive dependency, where a non-key attribute depends on another non-key attribute.</w:t>
-      </w:r>
-    </w:p>
-    <w:p>
-      <w:pPr>
-        <w:ind w:left="720"/>
-        <w:rPr>
-          <w:rFonts w:ascii="Times New Roman" w:hAnsi="Times New Roman" w:cs="Times New Roman"/>
-          <w:sz w:val="26"/>
-          <w:szCs w:val="26"/>
-        </w:rPr>
-      </w:pPr>
-      <w:r>
-        <w:rPr>
-          <w:rFonts w:ascii="Times New Roman" w:hAnsi="Times New Roman" w:cs="Times New Roman"/>
-          <w:sz w:val="26"/>
-          <w:szCs w:val="26"/>
-        </w:rPr>
-        <w:t>To avoid unnecessary dependencies, administrator details are stored separately in the ADMINISTRATOR table, while student details are stored in the STUDENT table.</w:t>
-      </w:r>
-    </w:p>
-    <w:p>
-      <w:pPr>
-        <w:ind w:left="720"/>
-        <w:rPr>
-          <w:rFonts w:ascii="Times New Roman" w:hAnsi="Times New Roman" w:cs="Times New Roman"/>
-          <w:sz w:val="26"/>
-          <w:szCs w:val="26"/>
-        </w:rPr>
-      </w:pPr>
-      <w:r>
-        <w:rPr>
-          <w:rFonts w:ascii="Times New Roman" w:hAnsi="Times New Roman" w:cs="Times New Roman"/>
-          <w:sz w:val="26"/>
-          <w:szCs w:val="26"/>
-        </w:rPr>
-        <w:t>For example:</w:t>
-      </w:r>
-    </w:p>
-    <w:p>
-      <w:pPr>
-        <w:ind w:left="720"/>
-        <w:rPr>
-          <w:rFonts w:ascii="Times New Roman" w:hAnsi="Times New Roman" w:cs="Times New Roman"/>
-          <w:sz w:val="26"/>
-          <w:szCs w:val="26"/>
-        </w:rPr>
-      </w:pPr>
-      <w:r>
-        <w:rPr>
-          <w:rFonts w:ascii="Times New Roman" w:hAnsi="Times New Roman" w:cs="Times New Roman"/>
-          <w:sz w:val="26"/>
-          <w:szCs w:val="26"/>
-        </w:rPr>
-        <w:t xml:space="preserve">Student </w:t>
-      </w:r>
-      <w:proofErr w:type="spellStart"/>
-      <w:r>
-        <w:rPr>
-          <w:rFonts w:ascii="Times New Roman" w:hAnsi="Times New Roman" w:cs="Times New Roman"/>
-          <w:sz w:val="26"/>
-          <w:szCs w:val="26"/>
-        </w:rPr>
-        <w:t>RegNo</w:t>
-      </w:r>
-      <w:proofErr w:type="spellEnd"/>
-      <w:r>
-        <w:rPr>
-          <w:rFonts w:ascii="Times New Roman" w:hAnsi="Times New Roman" w:cs="Times New Roman"/>
-          <w:sz w:val="26"/>
-          <w:szCs w:val="26"/>
-        </w:rPr>
-        <w:t xml:space="preserve"> → </w:t>
-      </w:r>
-      <w:proofErr w:type="spellStart"/>
-      <w:r>
-        <w:rPr>
-          <w:rFonts w:ascii="Times New Roman" w:hAnsi="Times New Roman" w:cs="Times New Roman"/>
-          <w:sz w:val="26"/>
-          <w:szCs w:val="26"/>
-        </w:rPr>
-        <w:t>AdminID</w:t>
-      </w:r>
-      <w:proofErr w:type="spellEnd"/>
-      <w:r>
-        <w:rPr>
-          <w:rFonts w:ascii="Times New Roman" w:hAnsi="Times New Roman" w:cs="Times New Roman"/>
-          <w:sz w:val="26"/>
-          <w:szCs w:val="26"/>
-        </w:rPr>
-        <w:t xml:space="preserve"> → Administrator details</w:t>
-      </w:r>
-    </w:p>
-    <w:p>
-      <w:pPr>
-        <w:ind w:left="720"/>
-        <w:rPr>
-          <w:rFonts w:ascii="Times New Roman" w:hAnsi="Times New Roman" w:cs="Times New Roman"/>
-          <w:sz w:val="26"/>
-          <w:szCs w:val="26"/>
-        </w:rPr>
-      </w:pPr>
-      <w:r>
-        <w:rPr>
-          <w:rFonts w:ascii="Times New Roman" w:hAnsi="Times New Roman" w:cs="Times New Roman"/>
-          <w:sz w:val="26"/>
-          <w:szCs w:val="26"/>
-        </w:rPr>
-        <w:t xml:space="preserve">Instead of storing administrator username and password repeatedly for every student, we store </w:t>
-      </w:r>
-      <w:proofErr w:type="spellStart"/>
-      <w:r>
-        <w:rPr>
-          <w:rFonts w:ascii="Times New Roman" w:hAnsi="Times New Roman" w:cs="Times New Roman"/>
-          <w:sz w:val="26"/>
-          <w:szCs w:val="26"/>
-        </w:rPr>
-        <w:t>AdminID</w:t>
-      </w:r>
-      <w:proofErr w:type="spellEnd"/>
-      <w:r>
-        <w:rPr>
-          <w:rFonts w:ascii="Times New Roman" w:hAnsi="Times New Roman" w:cs="Times New Roman"/>
-          <w:sz w:val="26"/>
-          <w:szCs w:val="26"/>
-        </w:rPr>
-        <w:t xml:space="preserve"> as a foreign key in STUDENT and keep the administrator details in the ADMINISTRATOR table.</w:t>
-      </w:r>
-    </w:p>
-    <w:p>
-      <w:pPr>
-        <w:ind w:left="720"/>
-        <w:rPr>
-          <w:rFonts w:ascii="Times New Roman" w:hAnsi="Times New Roman" w:cs="Times New Roman"/>
-          <w:sz w:val="26"/>
-          <w:szCs w:val="26"/>
-        </w:rPr>
-      </w:pPr>
-      <w:r>
-        <w:rPr>
-          <w:rFonts w:ascii="Times New Roman" w:hAnsi="Times New Roman" w:cs="Times New Roman"/>
-          <w:sz w:val="26"/>
-          <w:szCs w:val="26"/>
-        </w:rPr>
-        <w:t xml:space="preserve">Similarly, marks and attendance are stored separately using </w:t>
-      </w:r>
-      <w:proofErr w:type="spellStart"/>
-      <w:r>
-        <w:rPr>
-          <w:rFonts w:ascii="Times New Roman" w:hAnsi="Times New Roman" w:cs="Times New Roman"/>
-          <w:sz w:val="26"/>
-          <w:szCs w:val="26"/>
-        </w:rPr>
-        <w:t>RegNo</w:t>
-      </w:r>
-      <w:proofErr w:type="spellEnd"/>
-      <w:r>
-        <w:rPr>
-          <w:rFonts w:ascii="Times New Roman" w:hAnsi="Times New Roman" w:cs="Times New Roman"/>
-          <w:sz w:val="26"/>
-          <w:szCs w:val="26"/>
-        </w:rPr>
-        <w:t xml:space="preserve"> as a foreign key.</w:t>
-      </w:r>
-    </w:p>
-    <w:p>
-      <w:pPr>
-        <w:ind w:left="720"/>
-        <w:rPr>
-          <w:rFonts w:ascii="Times New Roman" w:hAnsi="Times New Roman" w:cs="Times New Roman"/>
-          <w:sz w:val="26"/>
-          <w:szCs w:val="26"/>
-        </w:rPr>
-      </w:pPr>
-      <w:r>
-        <w:rPr>
-          <w:rFonts w:ascii="Times New Roman" w:hAnsi="Times New Roman" w:cs="Times New Roman"/>
-          <w:sz w:val="26"/>
-          <w:szCs w:val="26"/>
-        </w:rPr>
-        <w:t>BCNF (Boyce-Codd Normal Form):</w:t>
-      </w:r>
-    </w:p>
-    <w:p>
-      <w:pPr>
-        <w:ind w:left="720"/>
-        <w:rPr>
-          <w:rFonts w:ascii="Times New Roman" w:hAnsi="Times New Roman" w:cs="Times New Roman"/>
-          <w:sz w:val="26"/>
-          <w:szCs w:val="26"/>
-        </w:rPr>
-      </w:pPr>
-      <w:r>
-        <w:rPr>
-          <w:rFonts w:ascii="Times New Roman" w:hAnsi="Times New Roman" w:cs="Times New Roman"/>
-          <w:sz w:val="26"/>
-          <w:szCs w:val="26"/>
-        </w:rPr>
-        <w:t>A relation is in BCNF when every determinant is a candidate key.</w:t>
-      </w:r>
-    </w:p>
-    <w:p>
-      <w:pPr>
-        <w:ind w:left="720"/>
-        <w:rPr>
-          <w:rFonts w:ascii="Times New Roman" w:hAnsi="Times New Roman" w:cs="Times New Roman"/>
-          <w:sz w:val="26"/>
-          <w:szCs w:val="26"/>
-        </w:rPr>
-      </w:pPr>
-      <w:r>
-        <w:rPr>
-          <w:rFonts w:ascii="Times New Roman" w:hAnsi="Times New Roman" w:cs="Times New Roman"/>
-          <w:sz w:val="26"/>
-          <w:szCs w:val="26"/>
-        </w:rPr>
-        <w:lastRenderedPageBreak/>
-        <w:t xml:space="preserve">In our database, the main determinants such as </w:t>
-      </w:r>
-      <w:proofErr w:type="spellStart"/>
-      <w:r>
-        <w:rPr>
-          <w:rFonts w:ascii="Times New Roman" w:hAnsi="Times New Roman" w:cs="Times New Roman"/>
-          <w:sz w:val="26"/>
-          <w:szCs w:val="26"/>
-        </w:rPr>
-        <w:t>AdminID</w:t>
-      </w:r>
-      <w:proofErr w:type="spellEnd"/>
-      <w:r>
-        <w:rPr>
-          <w:rFonts w:ascii="Times New Roman" w:hAnsi="Times New Roman" w:cs="Times New Roman"/>
-          <w:sz w:val="26"/>
-          <w:szCs w:val="26"/>
-        </w:rPr>
-        <w:t xml:space="preserve">, </w:t>
-      </w:r>
-      <w:proofErr w:type="spellStart"/>
-      <w:r>
-        <w:rPr>
-          <w:rFonts w:ascii="Times New Roman" w:hAnsi="Times New Roman" w:cs="Times New Roman"/>
-          <w:sz w:val="26"/>
-          <w:szCs w:val="26"/>
-        </w:rPr>
-        <w:t>RegNo</w:t>
-      </w:r>
-      <w:proofErr w:type="spellEnd"/>
-      <w:r>
-        <w:rPr>
-          <w:rFonts w:ascii="Times New Roman" w:hAnsi="Times New Roman" w:cs="Times New Roman"/>
-          <w:sz w:val="26"/>
-          <w:szCs w:val="26"/>
-        </w:rPr>
-        <w:t xml:space="preserve">, </w:t>
+        <w:t xml:space="preserve"> </w:t>
       </w:r>
       <w:proofErr w:type="spellStart"/>
       <w:r>
@@ -7500,7 +8481,7 @@
   <w:style w:type="paragraph" w:default="1" w:styleId="Normal">
     <w:name w:val="Normal"/>
     <w:qFormat/>
-    <w:rsid w:val="009A7BE7"/>
+    <w:rsid w:val="00152A73"/>
   </w:style>
   <w:style w:type="paragraph" w:styleId="Heading1">
     <w:name w:val="heading 1"/>
@@ -7704,7 +8685,6 @@
   <w:style w:type="character" w:default="1" w:styleId="DefaultParagraphFont">
     <w:name w:val="Default Paragraph Font"/>
     <w:uiPriority w:val="1"/>
-    <w:semiHidden/>
     <w:unhideWhenUsed/>
   </w:style>
   <w:style w:type="table" w:default="1" w:styleId="TableNormal">

</xml_diff>